<commit_message>
Add G7 trust video and testimonial kit to pillar scripts
Co-Authored-By: Claude Opus 5.5 <noreply@anthropic.com>
Claude-Session: https://claude.ai/code/session_01Vbjo1AHTFFxibnrbwg9mTj
</commit_message>
<xml_diff>
--- a/campaign/Pillar Video Scripts.docx
+++ b/campaign/Pillar Video Scripts.docx
@@ -67,7 +67,7 @@
           <w:sz w:val="22"/>
           <w:szCs w:val="22"/>
         </w:rPr>
-        <w:t xml:space="preserve">12 scripts · 6 content pillars × 2 voices</w:t>
+        <w:t xml:space="preserve">13 scripts · 6 content pillars × 2 voices + a trust video</w:t>
       </w:r>
     </w:p>
     <w:p>
@@ -81,7 +81,7 @@
           <w:sz w:val="22"/>
           <w:szCs w:val="22"/>
         </w:rPr>
-        <w:t xml:space="preserve">Every script in English and Taglish, with 3 hook options each</w:t>
+        <w:t xml:space="preserve">Every script in English and Taglish, with 3 hook options each, plus a Testimonial Kit</w:t>
       </w:r>
     </w:p>
     <w:p>
@@ -18102,9 +18102,1662 @@
     </w:p>
     <w:p>
       <w:pPr>
+        <w:pStyle w:val="Heading1"/>
+        <w:shd w:fill="0F2A4A" w:color="auto" w:val="clear"/>
+        <w:spacing w:after="240"/>
+      </w:pPr>
+      <w:r>
+        <w:rPr>
+          <w:rFonts w:ascii="Arial" w:cs="Arial" w:eastAsia="Arial" w:hAnsi="Arial"/>
+          <w:b/>
+          <w:bCs/>
+          <w:color w:val="FFFFFF"/>
+          <w:sz w:val="36"/>
+          <w:szCs w:val="36"/>
+        </w:rPr>
+        <w:t xml:space="preserve">  PART 3 · TRUST BUILDERS (COACH GILBERT)</w:t>
+      </w:r>
+    </w:p>
+    <w:p>
+      <w:pPr>
+        <w:spacing w:after="100" w:line="300"/>
+      </w:pPr>
+      <w:r>
+        <w:rPr>
+          <w:rFonts w:ascii="Arial" w:cs="Arial" w:eastAsia="Arial" w:hAnsi="Arial"/>
+          <w:b/>
+          <w:bCs/>
+          <w:sz w:val="21"/>
+          <w:szCs w:val="21"/>
+        </w:rPr>
+        <w:t xml:space="preserve">The doubt this part answers:</w:t>
+      </w:r>
+      <w:r>
+        <w:rPr>
+          <w:rFonts w:ascii="Arial" w:cs="Arial" w:eastAsia="Arial" w:hAnsi="Arial"/>
+          <w:sz w:val="21"/>
+          <w:szCs w:val="21"/>
+        </w:rPr>
+        <w:t xml:space="preserve"> </w:t>
+      </w:r>
+      <w:r>
+        <w:rPr>
+          <w:rFonts w:ascii="Arial" w:cs="Arial" w:eastAsia="Arial" w:hAnsi="Arial"/>
+          <w:i/>
+          <w:iCs/>
+          <w:sz w:val="21"/>
+          <w:szCs w:val="21"/>
+        </w:rPr>
+        <w:t xml:space="preserve">"I can learn break-even on Google. Why should I listen to you?"</w:t>
+      </w:r>
+    </w:p>
+    <w:p>
+      <w:pPr>
+        <w:spacing w:after="100" w:line="300"/>
+      </w:pPr>
+      <w:r>
+        <w:rPr>
+          <w:rFonts w:ascii="Arial" w:cs="Arial" w:eastAsia="Arial" w:hAnsi="Arial"/>
+          <w:b/>
+          <w:bCs/>
+          <w:sz w:val="21"/>
+          <w:szCs w:val="21"/>
+        </w:rPr>
+        <w:t xml:space="preserve">The answer:</w:t>
+      </w:r>
+      <w:r>
+        <w:rPr>
+          <w:rFonts w:ascii="Arial" w:cs="Arial" w:eastAsia="Arial" w:hAnsi="Arial"/>
+          <w:sz w:val="21"/>
+          <w:szCs w:val="21"/>
+        </w:rPr>
+        <w:t xml:space="preserve"> the formula is free, but getting the right numbers into it and hearing the truth about them is not. G7 says this out loud. The Testimonial Kit then collects proof from clients, because a client's result is more believable than Gilbert's own claim.</w:t>
+      </w:r>
+    </w:p>
+    <w:p>
+      <w:pPr>
         <w:pStyle w:val="Heading2"/>
         <w:pBdr>
-          <w:bottom w:val="single" w:color="E90D41" w:sz="8" w:space="4"/>
+          <w:bottom w:val="single" w:color="0F2A4A" w:sz="8" w:space="4"/>
+        </w:pBdr>
+        <w:spacing w:after="120" w:before="240"/>
+      </w:pPr>
+      <w:r>
+        <w:rPr>
+          <w:rFonts w:ascii="Arial" w:cs="Arial" w:eastAsia="Arial" w:hAnsi="Arial"/>
+          <w:b/>
+          <w:bCs/>
+          <w:color w:val="0F2A4A"/>
+          <w:sz w:val="30"/>
+          <w:szCs w:val="30"/>
+        </w:rPr>
+        <w:t xml:space="preserve">G7 · TRUST · "You can Google break-even. Here's what Google can't do."</w:t>
+      </w:r>
+    </w:p>
+    <w:p>
+      <w:pPr>
+        <w:spacing w:after="100" w:line="300"/>
+      </w:pPr>
+      <w:r>
+        <w:rPr>
+          <w:rFonts w:ascii="Arial" w:cs="Arial" w:eastAsia="Arial" w:hAnsi="Arial"/>
+          <w:b/>
+          <w:bCs/>
+          <w:sz w:val="21"/>
+          <w:szCs w:val="21"/>
+        </w:rPr>
+        <w:t xml:space="preserve">Reader:</w:t>
+      </w:r>
+      <w:r>
+        <w:rPr>
+          <w:rFonts w:ascii="Arial" w:cs="Arial" w:eastAsia="Arial" w:hAnsi="Arial"/>
+          <w:sz w:val="21"/>
+          <w:szCs w:val="21"/>
+        </w:rPr>
+        <w:t xml:space="preserve"> SME owner · </w:t>
+      </w:r>
+      <w:r>
+        <w:rPr>
+          <w:rFonts w:ascii="Arial" w:cs="Arial" w:eastAsia="Arial" w:hAnsi="Arial"/>
+          <w:b/>
+          <w:bCs/>
+          <w:sz w:val="21"/>
+          <w:szCs w:val="21"/>
+        </w:rPr>
+        <w:t xml:space="preserve">Runtime:</w:t>
+      </w:r>
+      <w:r>
+        <w:rPr>
+          <w:rFonts w:ascii="Arial" w:cs="Arial" w:eastAsia="Arial" w:hAnsi="Arial"/>
+          <w:sz w:val="21"/>
+          <w:szCs w:val="21"/>
+        </w:rPr>
+        <w:t xml:space="preserve"> ~75s · </w:t>
+      </w:r>
+      <w:r>
+        <w:rPr>
+          <w:rFonts w:ascii="Arial" w:cs="Arial" w:eastAsia="Arial" w:hAnsi="Arial"/>
+          <w:b/>
+          <w:bCs/>
+          <w:sz w:val="21"/>
+          <w:szCs w:val="21"/>
+        </w:rPr>
+        <w:t xml:space="preserve">Proof:</w:t>
+      </w:r>
+      <w:r>
+        <w:rPr>
+          <w:rFonts w:ascii="Arial" w:cs="Arial" w:eastAsia="Arial" w:hAnsi="Arial"/>
+          <w:sz w:val="21"/>
+          <w:szCs w:val="21"/>
+        </w:rPr>
+        <w:t xml:space="preserve"> 20+ companies' books every month; BRO Lending board seat · </w:t>
+      </w:r>
+      <w:r>
+        <w:rPr>
+          <w:rFonts w:ascii="Arial" w:cs="Arial" w:eastAsia="Arial" w:hAnsi="Arial"/>
+          <w:b/>
+          <w:bCs/>
+          <w:sz w:val="21"/>
+          <w:szCs w:val="21"/>
+        </w:rPr>
+        <w:t xml:space="preserve">Post:</w:t>
+      </w:r>
+      <w:r>
+        <w:rPr>
+          <w:rFonts w:ascii="Arial" w:cs="Arial" w:eastAsia="Arial" w:hAnsi="Arial"/>
+          <w:sz w:val="21"/>
+          <w:szCs w:val="21"/>
+        </w:rPr>
+        <w:t xml:space="preserve"> week 2, after viewers have seen G1 and G2</w:t>
+      </w:r>
+    </w:p>
+    <w:p>
+      <w:pPr>
+        <w:pStyle w:val="Heading3"/>
+        <w:spacing w:after="80" w:before="200"/>
+      </w:pPr>
+      <w:r>
+        <w:rPr>
+          <w:rFonts w:ascii="Arial" w:cs="Arial" w:eastAsia="Arial" w:hAnsi="Arial"/>
+          <w:b/>
+          <w:bCs/>
+          <w:color w:val="1A1A1A"/>
+          <w:sz w:val="24"/>
+          <w:szCs w:val="24"/>
+        </w:rPr>
+        <w:t xml:space="preserve">Hook options</w:t>
+      </w:r>
+    </w:p>
+    <w:tbl>
+      <w:tblPr>
+        <w:tblW w:type="dxa" w:w="9638"/>
+        <w:tblBorders>
+          <w:top w:val="single" w:color="auto" w:sz="4"/>
+          <w:left w:val="single" w:color="auto" w:sz="4"/>
+          <w:bottom w:val="single" w:color="auto" w:sz="4"/>
+          <w:right w:val="single" w:color="auto" w:sz="4"/>
+          <w:insideH w:val="single" w:color="auto" w:sz="4"/>
+          <w:insideV w:val="single" w:color="auto" w:sz="4"/>
+        </w:tblBorders>
+        <w:tblLayout w:type="fixed"/>
+      </w:tblPr>
+      <w:tblGrid>
+        <w:gridCol w:w="700"/>
+        <w:gridCol w:w="4469"/>
+        <w:gridCol w:w="4469"/>
+      </w:tblGrid>
+      <w:tr>
+        <w:trPr>
+          <w:tblHeader/>
+        </w:trPr>
+        <w:tc>
+          <w:tcPr>
+            <w:tcW w:type="dxa" w:w="700"/>
+            <w:shd w:fill="0F2A4A" w:color="auto" w:val="clear"/>
+            <w:tcMar>
+              <w:top w:type="dxa" w:w="80"/>
+              <w:left w:type="dxa" w:w="110"/>
+              <w:bottom w:type="dxa" w:w="80"/>
+              <w:right w:type="dxa" w:w="110"/>
+            </w:tcMar>
+          </w:tcPr>
+          <w:p/>
+        </w:tc>
+        <w:tc>
+          <w:tcPr>
+            <w:tcW w:type="dxa" w:w="4469"/>
+            <w:shd w:fill="0F2A4A" w:color="auto" w:val="clear"/>
+            <w:tcMar>
+              <w:top w:type="dxa" w:w="80"/>
+              <w:left w:type="dxa" w:w="110"/>
+              <w:bottom w:type="dxa" w:w="80"/>
+              <w:right w:type="dxa" w:w="110"/>
+            </w:tcMar>
+          </w:tcPr>
+          <w:p>
+            <w:r>
+              <w:rPr>
+                <w:rFonts w:ascii="Arial" w:cs="Arial" w:eastAsia="Arial" w:hAnsi="Arial"/>
+                <w:b/>
+                <w:bCs/>
+                <w:color w:val="FFFFFF"/>
+                <w:sz w:val="19"/>
+                <w:szCs w:val="19"/>
+              </w:rPr>
+              <w:t xml:space="preserve">English</w:t>
+            </w:r>
+          </w:p>
+        </w:tc>
+        <w:tc>
+          <w:tcPr>
+            <w:tcW w:type="dxa" w:w="4469"/>
+            <w:shd w:fill="0F2A4A" w:color="auto" w:val="clear"/>
+            <w:tcMar>
+              <w:top w:type="dxa" w:w="80"/>
+              <w:left w:type="dxa" w:w="110"/>
+              <w:bottom w:type="dxa" w:w="80"/>
+              <w:right w:type="dxa" w:w="110"/>
+            </w:tcMar>
+          </w:tcPr>
+          <w:p>
+            <w:r>
+              <w:rPr>
+                <w:rFonts w:ascii="Arial" w:cs="Arial" w:eastAsia="Arial" w:hAnsi="Arial"/>
+                <w:b/>
+                <w:bCs/>
+                <w:color w:val="FFFFFF"/>
+                <w:sz w:val="19"/>
+                <w:szCs w:val="19"/>
+              </w:rPr>
+              <w:t xml:space="preserve">Taglish</w:t>
+            </w:r>
+          </w:p>
+        </w:tc>
+      </w:tr>
+      <w:tr>
+        <w:tc>
+          <w:tcPr>
+            <w:tcW w:type="dxa" w:w="700"/>
+            <w:shd w:fill="FFF4D6" w:color="auto" w:val="clear"/>
+            <w:tcMar>
+              <w:top w:type="dxa" w:w="80"/>
+              <w:left w:type="dxa" w:w="110"/>
+              <w:bottom w:type="dxa" w:w="80"/>
+              <w:right w:type="dxa" w:w="110"/>
+            </w:tcMar>
+          </w:tcPr>
+          <w:p>
+            <w:r>
+              <w:rPr>
+                <w:rFonts w:ascii="Arial" w:cs="Arial" w:eastAsia="Arial" w:hAnsi="Arial"/>
+                <w:b w:val="false"/>
+                <w:bCs w:val="false"/>
+                <w:color w:val="1A1A1A"/>
+                <w:sz w:val="19"/>
+                <w:szCs w:val="19"/>
+              </w:rPr>
+              <w:t xml:space="preserve">A ⭐</w:t>
+            </w:r>
+          </w:p>
+        </w:tc>
+        <w:tc>
+          <w:tcPr>
+            <w:tcW w:type="dxa" w:w="4469"/>
+            <w:tcMar>
+              <w:top w:type="dxa" w:w="80"/>
+              <w:left w:type="dxa" w:w="110"/>
+              <w:bottom w:type="dxa" w:w="80"/>
+              <w:right w:type="dxa" w:w="110"/>
+            </w:tcMar>
+          </w:tcPr>
+          <w:p>
+            <w:r>
+              <w:rPr>
+                <w:rFonts w:ascii="Arial" w:cs="Arial" w:eastAsia="Arial" w:hAnsi="Arial"/>
+                <w:b w:val="false"/>
+                <w:bCs w:val="false"/>
+                <w:color w:val="1A1A1A"/>
+                <w:sz w:val="19"/>
+                <w:szCs w:val="19"/>
+              </w:rPr>
+              <w:t xml:space="preserve">You can Google break-even in 5 minutes. So why do owners still guess?</w:t>
+            </w:r>
+          </w:p>
+        </w:tc>
+        <w:tc>
+          <w:tcPr>
+            <w:tcW w:type="dxa" w:w="4469"/>
+            <w:tcMar>
+              <w:top w:type="dxa" w:w="80"/>
+              <w:left w:type="dxa" w:w="110"/>
+              <w:bottom w:type="dxa" w:w="80"/>
+              <w:right w:type="dxa" w:w="110"/>
+            </w:tcMar>
+          </w:tcPr>
+          <w:p>
+            <w:r>
+              <w:rPr>
+                <w:rFonts w:ascii="Arial" w:cs="Arial" w:eastAsia="Arial" w:hAnsi="Arial"/>
+                <w:b w:val="false"/>
+                <w:bCs w:val="false"/>
+                <w:color w:val="1A1A1A"/>
+                <w:sz w:val="19"/>
+                <w:szCs w:val="19"/>
+              </w:rPr>
+              <w:t xml:space="preserve">Kaya mong i-Google ang breakeven in 5 minutes. Bakit nanghuhula pa rin ang owners?</w:t>
+            </w:r>
+          </w:p>
+        </w:tc>
+      </w:tr>
+      <w:tr>
+        <w:tc>
+          <w:tcPr>
+            <w:tcW w:type="dxa" w:w="700"/>
+            <w:shd w:fill="F6F6F6" w:color="auto" w:val="clear"/>
+            <w:tcMar>
+              <w:top w:type="dxa" w:w="80"/>
+              <w:left w:type="dxa" w:w="110"/>
+              <w:bottom w:type="dxa" w:w="80"/>
+              <w:right w:type="dxa" w:w="110"/>
+            </w:tcMar>
+          </w:tcPr>
+          <w:p>
+            <w:r>
+              <w:rPr>
+                <w:rFonts w:ascii="Arial" w:cs="Arial" w:eastAsia="Arial" w:hAnsi="Arial"/>
+                <w:b w:val="false"/>
+                <w:bCs w:val="false"/>
+                <w:color w:val="1A1A1A"/>
+                <w:sz w:val="19"/>
+                <w:szCs w:val="19"/>
+              </w:rPr>
+              <w:t xml:space="preserve">B</w:t>
+            </w:r>
+          </w:p>
+        </w:tc>
+        <w:tc>
+          <w:tcPr>
+            <w:tcW w:type="dxa" w:w="4469"/>
+            <w:shd w:fill="F6F6F6" w:color="auto" w:val="clear"/>
+            <w:tcMar>
+              <w:top w:type="dxa" w:w="80"/>
+              <w:left w:type="dxa" w:w="110"/>
+              <w:bottom w:type="dxa" w:w="80"/>
+              <w:right w:type="dxa" w:w="110"/>
+            </w:tcMar>
+          </w:tcPr>
+          <w:p>
+            <w:r>
+              <w:rPr>
+                <w:rFonts w:ascii="Arial" w:cs="Arial" w:eastAsia="Arial" w:hAnsi="Arial"/>
+                <w:b w:val="false"/>
+                <w:bCs w:val="false"/>
+                <w:color w:val="1A1A1A"/>
+                <w:sz w:val="19"/>
+                <w:szCs w:val="19"/>
+              </w:rPr>
+              <w:t xml:space="preserve">The break-even formula is free. Your real numbers are not.</w:t>
+            </w:r>
+          </w:p>
+        </w:tc>
+        <w:tc>
+          <w:tcPr>
+            <w:tcW w:type="dxa" w:w="4469"/>
+            <w:shd w:fill="F6F6F6" w:color="auto" w:val="clear"/>
+            <w:tcMar>
+              <w:top w:type="dxa" w:w="80"/>
+              <w:left w:type="dxa" w:w="110"/>
+              <w:bottom w:type="dxa" w:w="80"/>
+              <w:right w:type="dxa" w:w="110"/>
+            </w:tcMar>
+          </w:tcPr>
+          <w:p>
+            <w:r>
+              <w:rPr>
+                <w:rFonts w:ascii="Arial" w:cs="Arial" w:eastAsia="Arial" w:hAnsi="Arial"/>
+                <w:b w:val="false"/>
+                <w:bCs w:val="false"/>
+                <w:color w:val="1A1A1A"/>
+                <w:sz w:val="19"/>
+                <w:szCs w:val="19"/>
+              </w:rPr>
+              <w:t xml:space="preserve">Libre ang breakeven formula. Ang totoong numbers mo, hindi.</w:t>
+            </w:r>
+          </w:p>
+        </w:tc>
+      </w:tr>
+      <w:tr>
+        <w:tc>
+          <w:tcPr>
+            <w:tcW w:type="dxa" w:w="700"/>
+            <w:tcMar>
+              <w:top w:type="dxa" w:w="80"/>
+              <w:left w:type="dxa" w:w="110"/>
+              <w:bottom w:type="dxa" w:w="80"/>
+              <w:right w:type="dxa" w:w="110"/>
+            </w:tcMar>
+          </w:tcPr>
+          <w:p>
+            <w:r>
+              <w:rPr>
+                <w:rFonts w:ascii="Arial" w:cs="Arial" w:eastAsia="Arial" w:hAnsi="Arial"/>
+                <w:b w:val="false"/>
+                <w:bCs w:val="false"/>
+                <w:color w:val="1A1A1A"/>
+                <w:sz w:val="19"/>
+                <w:szCs w:val="19"/>
+              </w:rPr>
+              <w:t xml:space="preserve">C</w:t>
+            </w:r>
+          </w:p>
+        </w:tc>
+        <w:tc>
+          <w:tcPr>
+            <w:tcW w:type="dxa" w:w="4469"/>
+            <w:tcMar>
+              <w:top w:type="dxa" w:w="80"/>
+              <w:left w:type="dxa" w:w="110"/>
+              <w:bottom w:type="dxa" w:w="80"/>
+              <w:right w:type="dxa" w:w="110"/>
+            </w:tcMar>
+          </w:tcPr>
+          <w:p>
+            <w:r>
+              <w:rPr>
+                <w:rFonts w:ascii="Arial" w:cs="Arial" w:eastAsia="Arial" w:hAnsi="Arial"/>
+                <w:b w:val="false"/>
+                <w:bCs w:val="false"/>
+                <w:color w:val="1A1A1A"/>
+                <w:sz w:val="19"/>
+                <w:szCs w:val="19"/>
+              </w:rPr>
+              <w:t xml:space="preserve">Google can teach you the formula. It will never tell you "don't borrow yet."</w:t>
+            </w:r>
+          </w:p>
+        </w:tc>
+        <w:tc>
+          <w:tcPr>
+            <w:tcW w:type="dxa" w:w="4469"/>
+            <w:tcMar>
+              <w:top w:type="dxa" w:w="80"/>
+              <w:left w:type="dxa" w:w="110"/>
+              <w:bottom w:type="dxa" w:w="80"/>
+              <w:right w:type="dxa" w:w="110"/>
+            </w:tcMar>
+          </w:tcPr>
+          <w:p>
+            <w:r>
+              <w:rPr>
+                <w:rFonts w:ascii="Arial" w:cs="Arial" w:eastAsia="Arial" w:hAnsi="Arial"/>
+                <w:b w:val="false"/>
+                <w:bCs w:val="false"/>
+                <w:color w:val="1A1A1A"/>
+                <w:sz w:val="19"/>
+                <w:szCs w:val="19"/>
+              </w:rPr>
+              <w:t xml:space="preserve">Kaya kang turuan ng Google ng formula. Pero hindi ka nito sasabihan ng "huwag ka munang mangutang."</w:t>
+            </w:r>
+          </w:p>
+        </w:tc>
+      </w:tr>
+    </w:tbl>
+    <w:p>
+      <w:pPr>
+        <w:spacing w:after="120"/>
+      </w:pPr>
+    </w:p>
+    <w:p>
+      <w:pPr>
+        <w:pStyle w:val="Heading3"/>
+        <w:spacing w:after="80" w:before="200"/>
+      </w:pPr>
+      <w:r>
+        <w:rPr>
+          <w:rFonts w:ascii="Arial" w:cs="Arial" w:eastAsia="Arial" w:hAnsi="Arial"/>
+          <w:b/>
+          <w:bCs/>
+          <w:color w:val="1A1A1A"/>
+          <w:sz w:val="24"/>
+          <w:szCs w:val="24"/>
+        </w:rPr>
+        <w:t xml:space="preserve">English</w:t>
+      </w:r>
+    </w:p>
+    <w:p>
+      <w:pPr>
+        <w:pBdr>
+          <w:left w:val="single" w:color="0F2A4A" w:sz="18" w:space="10"/>
+        </w:pBdr>
+        <w:shd w:fill="FAFAFA" w:color="auto" w:val="clear"/>
+        <w:spacing w:after="20" w:before="60"/>
+        <w:ind w:left="200"/>
+      </w:pPr>
+      <w:r>
+        <w:rPr>
+          <w:rFonts w:ascii="Arial" w:cs="Arial" w:eastAsia="Arial" w:hAnsi="Arial"/>
+          <w:b/>
+          <w:bCs/>
+          <w:color w:val="0F2A4A"/>
+          <w:sz w:val="18"/>
+          <w:szCs w:val="18"/>
+        </w:rPr>
+        <w:t xml:space="preserve">[0:00 · Hook]</w:t>
+      </w:r>
+    </w:p>
+    <w:p>
+      <w:pPr>
+        <w:pBdr>
+          <w:left w:val="single" w:color="0F2A4A" w:sz="18" w:space="10"/>
+        </w:pBdr>
+        <w:shd w:fill="FAFAFA" w:color="auto" w:val="clear"/>
+        <w:spacing w:after="40" w:line="320"/>
+        <w:ind w:left="200"/>
+      </w:pPr>
+      <w:r>
+        <w:rPr>
+          <w:rFonts w:ascii="Arial" w:cs="Arial" w:eastAsia="Arial" w:hAnsi="Arial"/>
+          <w:sz w:val="22"/>
+          <w:szCs w:val="22"/>
+        </w:rPr>
+        <w:t xml:space="preserve">You can learn the break-even formula on Google in five minutes.</w:t>
+      </w:r>
+    </w:p>
+    <w:p>
+      <w:pPr>
+        <w:pBdr>
+          <w:left w:val="single" w:color="0F2A4A" w:sz="18" w:space="10"/>
+        </w:pBdr>
+        <w:shd w:fill="FAFAFA" w:color="auto" w:val="clear"/>
+        <w:spacing w:after="40" w:line="320"/>
+        <w:ind w:left="200"/>
+      </w:pPr>
+      <w:r>
+        <w:rPr>
+          <w:rFonts w:ascii="Arial" w:cs="Arial" w:eastAsia="Arial" w:hAnsi="Arial"/>
+          <w:sz w:val="22"/>
+          <w:szCs w:val="22"/>
+        </w:rPr>
+        <w:t xml:space="preserve">So let me give it to you for free, right now.</w:t>
+      </w:r>
+    </w:p>
+    <w:p>
+      <w:pPr>
+        <w:spacing w:after="40"/>
+      </w:pPr>
+    </w:p>
+    <w:p>
+      <w:pPr>
+        <w:pBdr>
+          <w:left w:val="single" w:color="0F2A4A" w:sz="18" w:space="10"/>
+        </w:pBdr>
+        <w:shd w:fill="FAFAFA" w:color="auto" w:val="clear"/>
+        <w:spacing w:after="20" w:before="60"/>
+        <w:ind w:left="200"/>
+      </w:pPr>
+      <w:r>
+        <w:rPr>
+          <w:rFonts w:ascii="Arial" w:cs="Arial" w:eastAsia="Arial" w:hAnsi="Arial"/>
+          <w:b/>
+          <w:bCs/>
+          <w:color w:val="0F2A4A"/>
+          <w:sz w:val="18"/>
+          <w:szCs w:val="18"/>
+        </w:rPr>
+        <w:t xml:space="preserve">[0:06 · The formula]</w:t>
+      </w:r>
+      <w:r>
+        <w:rPr>
+          <w:rFonts w:ascii="Arial" w:cs="Arial" w:eastAsia="Arial" w:hAnsi="Arial"/>
+        </w:rPr>
+        <w:t xml:space="preserve">  </w:t>
+      </w:r>
+      <w:r>
+        <w:rPr>
+          <w:rFonts w:ascii="Arial" w:cs="Arial" w:eastAsia="Arial" w:hAnsi="Arial"/>
+          <w:i/>
+          <w:iCs/>
+          <w:color w:val="5B5B5B"/>
+          <w:sz w:val="18"/>
+          <w:szCs w:val="18"/>
+        </w:rPr>
+        <w:t xml:space="preserve">(On screen, big: FIXED COSTS ÷ (PRICE − COST PER UNIT))</w:t>
+      </w:r>
+    </w:p>
+    <w:p>
+      <w:pPr>
+        <w:pBdr>
+          <w:left w:val="single" w:color="0F2A4A" w:sz="18" w:space="10"/>
+        </w:pBdr>
+        <w:shd w:fill="FAFAFA" w:color="auto" w:val="clear"/>
+        <w:spacing w:after="40" w:line="320"/>
+        <w:ind w:left="200"/>
+      </w:pPr>
+      <w:r>
+        <w:rPr>
+          <w:rFonts w:ascii="Arial" w:cs="Arial" w:eastAsia="Arial" w:hAnsi="Arial"/>
+          <w:sz w:val="22"/>
+          <w:szCs w:val="22"/>
+        </w:rPr>
+        <w:t xml:space="preserve">Fixed costs, divided by your price minus the cost of one unit.</w:t>
+      </w:r>
+    </w:p>
+    <w:p>
+      <w:pPr>
+        <w:spacing w:after="40"/>
+      </w:pPr>
+    </w:p>
+    <w:p>
+      <w:pPr>
+        <w:pBdr>
+          <w:left w:val="single" w:color="0F2A4A" w:sz="18" w:space="10"/>
+        </w:pBdr>
+        <w:shd w:fill="FAFAFA" w:color="auto" w:val="clear"/>
+        <w:spacing w:after="20" w:before="60"/>
+        <w:ind w:left="200"/>
+      </w:pPr>
+      <w:r>
+        <w:rPr>
+          <w:rFonts w:ascii="Arial" w:cs="Arial" w:eastAsia="Arial" w:hAnsi="Arial"/>
+          <w:b/>
+          <w:bCs/>
+          <w:color w:val="0F2A4A"/>
+          <w:sz w:val="18"/>
+          <w:szCs w:val="18"/>
+        </w:rPr>
+        <w:t xml:space="preserve">[0:11 · Example]</w:t>
+      </w:r>
+      <w:r>
+        <w:rPr>
+          <w:rFonts w:ascii="Arial" w:cs="Arial" w:eastAsia="Arial" w:hAnsi="Arial"/>
+        </w:rPr>
+        <w:t xml:space="preserve">  </w:t>
+      </w:r>
+      <w:r>
+        <w:rPr>
+          <w:rFonts w:ascii="Arial" w:cs="Arial" w:eastAsia="Arial" w:hAnsi="Arial"/>
+          <w:i/>
+          <w:iCs/>
+          <w:color w:val="5B5B5B"/>
+          <w:sz w:val="18"/>
+          <w:szCs w:val="18"/>
+        </w:rPr>
+        <w:t xml:space="preserve">(On screen: "EXAMPLE ONLY" with the numbers written by hand on paper)</w:t>
+      </w:r>
+    </w:p>
+    <w:p>
+      <w:pPr>
+        <w:pBdr>
+          <w:left w:val="single" w:color="0F2A4A" w:sz="18" w:space="10"/>
+        </w:pBdr>
+        <w:shd w:fill="FAFAFA" w:color="auto" w:val="clear"/>
+        <w:spacing w:after="40" w:line="320"/>
+        <w:ind w:left="200"/>
+      </w:pPr>
+      <w:r>
+        <w:rPr>
+          <w:rFonts w:ascii="Arial" w:cs="Arial" w:eastAsia="Arial" w:hAnsi="Arial"/>
+          <w:sz w:val="22"/>
+          <w:szCs w:val="22"/>
+        </w:rPr>
+        <w:t xml:space="preserve">Example only. Your rent, salaries and bills are ₱30,000 a month.</w:t>
+      </w:r>
+    </w:p>
+    <w:p>
+      <w:pPr>
+        <w:pBdr>
+          <w:left w:val="single" w:color="0F2A4A" w:sz="18" w:space="10"/>
+        </w:pBdr>
+        <w:shd w:fill="FAFAFA" w:color="auto" w:val="clear"/>
+        <w:spacing w:after="40" w:line="320"/>
+        <w:ind w:left="200"/>
+      </w:pPr>
+      <w:r>
+        <w:rPr>
+          <w:rFonts w:ascii="Arial" w:cs="Arial" w:eastAsia="Arial" w:hAnsi="Arial"/>
+          <w:sz w:val="22"/>
+          <w:szCs w:val="22"/>
+        </w:rPr>
+        <w:t xml:space="preserve">You sell at ₱100, and each one costs you ₱70.</w:t>
+      </w:r>
+    </w:p>
+    <w:p>
+      <w:pPr>
+        <w:pBdr>
+          <w:left w:val="single" w:color="0F2A4A" w:sz="18" w:space="10"/>
+        </w:pBdr>
+        <w:shd w:fill="FAFAFA" w:color="auto" w:val="clear"/>
+        <w:spacing w:after="40" w:line="320"/>
+        <w:ind w:left="200"/>
+      </w:pPr>
+      <w:r>
+        <w:rPr>
+          <w:rFonts w:ascii="Arial" w:cs="Arial" w:eastAsia="Arial" w:hAnsi="Arial"/>
+          <w:sz w:val="22"/>
+          <w:szCs w:val="22"/>
+        </w:rPr>
+        <w:t xml:space="preserve">So each sale leaves ₱30. ₱30,000 divided by ₱30 is 1,000 sales.</w:t>
+      </w:r>
+    </w:p>
+    <w:p>
+      <w:pPr>
+        <w:pBdr>
+          <w:left w:val="single" w:color="0F2A4A" w:sz="18" w:space="10"/>
+        </w:pBdr>
+        <w:shd w:fill="FAFAFA" w:color="auto" w:val="clear"/>
+        <w:spacing w:after="40" w:line="320"/>
+        <w:ind w:left="200"/>
+      </w:pPr>
+      <w:r>
+        <w:rPr>
+          <w:rFonts w:ascii="Arial" w:cs="Arial" w:eastAsia="Arial" w:hAnsi="Arial"/>
+          <w:sz w:val="22"/>
+          <w:szCs w:val="22"/>
+        </w:rPr>
+        <w:t xml:space="preserve">That is your break-even.</w:t>
+      </w:r>
+    </w:p>
+    <w:p>
+      <w:pPr>
+        <w:spacing w:after="40"/>
+      </w:pPr>
+    </w:p>
+    <w:p>
+      <w:pPr>
+        <w:pBdr>
+          <w:left w:val="single" w:color="0F2A4A" w:sz="18" w:space="10"/>
+        </w:pBdr>
+        <w:shd w:fill="FAFAFA" w:color="auto" w:val="clear"/>
+        <w:spacing w:after="20" w:before="60"/>
+        <w:ind w:left="200"/>
+      </w:pPr>
+      <w:r>
+        <w:rPr>
+          <w:rFonts w:ascii="Arial" w:cs="Arial" w:eastAsia="Arial" w:hAnsi="Arial"/>
+          <w:b/>
+          <w:bCs/>
+          <w:color w:val="0F2A4A"/>
+          <w:sz w:val="18"/>
+          <w:szCs w:val="18"/>
+        </w:rPr>
+        <w:t xml:space="preserve">[0:26 · The turn]</w:t>
+      </w:r>
+    </w:p>
+    <w:p>
+      <w:pPr>
+        <w:pBdr>
+          <w:left w:val="single" w:color="0F2A4A" w:sz="18" w:space="10"/>
+        </w:pBdr>
+        <w:shd w:fill="FAFAFA" w:color="auto" w:val="clear"/>
+        <w:spacing w:after="40" w:line="320"/>
+        <w:ind w:left="200"/>
+      </w:pPr>
+      <w:r>
+        <w:rPr>
+          <w:rFonts w:ascii="Arial" w:cs="Arial" w:eastAsia="Arial" w:hAnsi="Arial"/>
+          <w:sz w:val="22"/>
+          <w:szCs w:val="22"/>
+        </w:rPr>
+        <w:t xml:space="preserve">And yet, the financial statements of more than twenty companies crossed my desk every month, and the formula was never the problem.</w:t>
+      </w:r>
+    </w:p>
+    <w:p>
+      <w:pPr>
+        <w:spacing w:after="40"/>
+      </w:pPr>
+    </w:p>
+    <w:p>
+      <w:pPr>
+        <w:pBdr>
+          <w:left w:val="single" w:color="0F2A4A" w:sz="18" w:space="10"/>
+        </w:pBdr>
+        <w:shd w:fill="FAFAFA" w:color="auto" w:val="clear"/>
+        <w:spacing w:after="20" w:before="60"/>
+        <w:ind w:left="200"/>
+      </w:pPr>
+      <w:r>
+        <w:rPr>
+          <w:rFonts w:ascii="Arial" w:cs="Arial" w:eastAsia="Arial" w:hAnsi="Arial"/>
+          <w:b/>
+          <w:bCs/>
+          <w:color w:val="0F2A4A"/>
+          <w:sz w:val="18"/>
+          <w:szCs w:val="18"/>
+        </w:rPr>
+        <w:t xml:space="preserve">[0:34 · The gap]</w:t>
+      </w:r>
+    </w:p>
+    <w:p>
+      <w:pPr>
+        <w:pBdr>
+          <w:left w:val="single" w:color="0F2A4A" w:sz="18" w:space="10"/>
+        </w:pBdr>
+        <w:shd w:fill="FAFAFA" w:color="auto" w:val="clear"/>
+        <w:spacing w:after="40" w:line="320"/>
+        <w:ind w:left="200"/>
+      </w:pPr>
+      <w:r>
+        <w:rPr>
+          <w:rFonts w:ascii="Arial" w:cs="Arial" w:eastAsia="Arial" w:hAnsi="Arial"/>
+          <w:sz w:val="22"/>
+          <w:szCs w:val="22"/>
+        </w:rPr>
+        <w:t xml:space="preserve">The problem was the numbers going into it.</w:t>
+      </w:r>
+    </w:p>
+    <w:p>
+      <w:pPr>
+        <w:pBdr>
+          <w:left w:val="single" w:color="0F2A4A" w:sz="18" w:space="10"/>
+        </w:pBdr>
+        <w:shd w:fill="FAFAFA" w:color="auto" w:val="clear"/>
+        <w:spacing w:after="40" w:line="320"/>
+        <w:ind w:left="200"/>
+      </w:pPr>
+      <w:r>
+        <w:rPr>
+          <w:rFonts w:ascii="Arial" w:cs="Arial" w:eastAsia="Arial" w:hAnsi="Arial"/>
+          <w:sz w:val="22"/>
+          <w:szCs w:val="22"/>
+        </w:rPr>
+        <w:t xml:space="preserve">The ₱70 that was really ₱85, because nobody counted delivery and spoilage.</w:t>
+      </w:r>
+    </w:p>
+    <w:p>
+      <w:pPr>
+        <w:pBdr>
+          <w:left w:val="single" w:color="0F2A4A" w:sz="18" w:space="10"/>
+        </w:pBdr>
+        <w:shd w:fill="FAFAFA" w:color="auto" w:val="clear"/>
+        <w:spacing w:after="40" w:line="320"/>
+        <w:ind w:left="200"/>
+      </w:pPr>
+      <w:r>
+        <w:rPr>
+          <w:rFonts w:ascii="Arial" w:cs="Arial" w:eastAsia="Arial" w:hAnsi="Arial"/>
+          <w:sz w:val="22"/>
+          <w:szCs w:val="22"/>
+        </w:rPr>
+        <w:t xml:space="preserve">The owner's own salary, never written down.</w:t>
+      </w:r>
+    </w:p>
+    <w:p>
+      <w:pPr>
+        <w:pBdr>
+          <w:left w:val="single" w:color="0F2A4A" w:sz="18" w:space="10"/>
+        </w:pBdr>
+        <w:shd w:fill="FAFAFA" w:color="auto" w:val="clear"/>
+        <w:spacing w:after="40" w:line="320"/>
+        <w:ind w:left="200"/>
+      </w:pPr>
+      <w:r>
+        <w:rPr>
+          <w:rFonts w:ascii="Arial" w:cs="Arial" w:eastAsia="Arial" w:hAnsi="Arial"/>
+          <w:sz w:val="22"/>
+          <w:szCs w:val="22"/>
+        </w:rPr>
+        <w:t xml:space="preserve">The receivables that were sales on paper but not cash in hand.</w:t>
+      </w:r>
+    </w:p>
+    <w:p>
+      <w:pPr>
+        <w:pBdr>
+          <w:left w:val="single" w:color="0F2A4A" w:sz="18" w:space="10"/>
+        </w:pBdr>
+        <w:shd w:fill="FAFAFA" w:color="auto" w:val="clear"/>
+        <w:spacing w:after="40" w:line="320"/>
+        <w:ind w:left="200"/>
+      </w:pPr>
+      <w:r>
+        <w:rPr>
+          <w:rFonts w:ascii="Arial" w:cs="Arial" w:eastAsia="Arial" w:hAnsi="Arial"/>
+          <w:sz w:val="22"/>
+          <w:szCs w:val="22"/>
+        </w:rPr>
+        <w:t xml:space="preserve">And when ₱70 is really ₱85, each sale leaves only ₱15. Your break-even is not 1,000. It is 2,000.</w:t>
+      </w:r>
+    </w:p>
+    <w:p>
+      <w:pPr>
+        <w:spacing w:after="40"/>
+      </w:pPr>
+    </w:p>
+    <w:p>
+      <w:pPr>
+        <w:pBdr>
+          <w:left w:val="single" w:color="0F2A4A" w:sz="18" w:space="10"/>
+        </w:pBdr>
+        <w:shd w:fill="FAFAFA" w:color="auto" w:val="clear"/>
+        <w:spacing w:after="20" w:before="60"/>
+        <w:ind w:left="200"/>
+      </w:pPr>
+      <w:r>
+        <w:rPr>
+          <w:rFonts w:ascii="Arial" w:cs="Arial" w:eastAsia="Arial" w:hAnsi="Arial"/>
+          <w:b/>
+          <w:bCs/>
+          <w:color w:val="0F2A4A"/>
+          <w:sz w:val="18"/>
+          <w:szCs w:val="18"/>
+        </w:rPr>
+        <w:t xml:space="preserve">[0:54 · Verdict]</w:t>
+      </w:r>
+    </w:p>
+    <w:p>
+      <w:pPr>
+        <w:pBdr>
+          <w:left w:val="single" w:color="0F2A4A" w:sz="18" w:space="10"/>
+        </w:pBdr>
+        <w:shd w:fill="FAFAFA" w:color="auto" w:val="clear"/>
+        <w:spacing w:after="40" w:line="320"/>
+        <w:ind w:left="200"/>
+      </w:pPr>
+      <w:r>
+        <w:rPr>
+          <w:rFonts w:ascii="Arial" w:cs="Arial" w:eastAsia="Arial" w:hAnsi="Arial"/>
+          <w:sz w:val="22"/>
+          <w:szCs w:val="22"/>
+        </w:rPr>
+        <w:t xml:space="preserve">The formula is free. Your real numbers are not.</w:t>
+      </w:r>
+    </w:p>
+    <w:p>
+      <w:pPr>
+        <w:spacing w:after="40"/>
+      </w:pPr>
+    </w:p>
+    <w:p>
+      <w:pPr>
+        <w:pBdr>
+          <w:left w:val="single" w:color="0F2A4A" w:sz="18" w:space="10"/>
+        </w:pBdr>
+        <w:shd w:fill="FAFAFA" w:color="auto" w:val="clear"/>
+        <w:spacing w:after="20" w:before="60"/>
+        <w:ind w:left="200"/>
+      </w:pPr>
+      <w:r>
+        <w:rPr>
+          <w:rFonts w:ascii="Arial" w:cs="Arial" w:eastAsia="Arial" w:hAnsi="Arial"/>
+          <w:b/>
+          <w:bCs/>
+          <w:color w:val="0F2A4A"/>
+          <w:sz w:val="18"/>
+          <w:szCs w:val="18"/>
+        </w:rPr>
+        <w:t xml:space="preserve">[0:58 · What Google can't do]</w:t>
+      </w:r>
+    </w:p>
+    <w:p>
+      <w:pPr>
+        <w:pBdr>
+          <w:left w:val="single" w:color="0F2A4A" w:sz="18" w:space="10"/>
+        </w:pBdr>
+        <w:shd w:fill="FAFAFA" w:color="auto" w:val="clear"/>
+        <w:spacing w:after="40" w:line="320"/>
+        <w:ind w:left="200"/>
+      </w:pPr>
+      <w:r>
+        <w:rPr>
+          <w:rFonts w:ascii="Arial" w:cs="Arial" w:eastAsia="Arial" w:hAnsi="Arial"/>
+          <w:sz w:val="22"/>
+          <w:szCs w:val="22"/>
+        </w:rPr>
+        <w:t xml:space="preserve">And Google will never look at your books and tell you, "Don't borrow yet. Don't hire yet. Fix this first."</w:t>
+      </w:r>
+    </w:p>
+    <w:p>
+      <w:pPr>
+        <w:pBdr>
+          <w:left w:val="single" w:color="0F2A4A" w:sz="18" w:space="10"/>
+        </w:pBdr>
+        <w:shd w:fill="FAFAFA" w:color="auto" w:val="clear"/>
+        <w:spacing w:after="40" w:line="320"/>
+        <w:ind w:left="200"/>
+      </w:pPr>
+      <w:r>
+        <w:rPr>
+          <w:rFonts w:ascii="Arial" w:cs="Arial" w:eastAsia="Arial" w:hAnsi="Arial"/>
+          <w:sz w:val="22"/>
+          <w:szCs w:val="22"/>
+        </w:rPr>
+        <w:t xml:space="preserve">That is what I told a client who wanted to borrow up to ten million pesos at 5% a month. They opened their books to me, and they put me on their board.</w:t>
+      </w:r>
+    </w:p>
+    <w:p>
+      <w:pPr>
+        <w:spacing w:after="40"/>
+      </w:pPr>
+    </w:p>
+    <w:p>
+      <w:pPr>
+        <w:pBdr>
+          <w:left w:val="single" w:color="0F2A4A" w:sz="18" w:space="10"/>
+        </w:pBdr>
+        <w:shd w:fill="FAFAFA" w:color="auto" w:val="clear"/>
+        <w:spacing w:after="20" w:before="60"/>
+        <w:ind w:left="200"/>
+      </w:pPr>
+      <w:r>
+        <w:rPr>
+          <w:rFonts w:ascii="Arial" w:cs="Arial" w:eastAsia="Arial" w:hAnsi="Arial"/>
+          <w:b/>
+          <w:bCs/>
+          <w:color w:val="0F2A4A"/>
+          <w:sz w:val="18"/>
+          <w:szCs w:val="18"/>
+        </w:rPr>
+        <w:t xml:space="preserve">[1:10 · CTA]</w:t>
+      </w:r>
+    </w:p>
+    <w:p>
+      <w:pPr>
+        <w:pBdr>
+          <w:left w:val="single" w:color="0F2A4A" w:sz="18" w:space="10"/>
+        </w:pBdr>
+        <w:shd w:fill="FAFAFA" w:color="auto" w:val="clear"/>
+        <w:spacing w:after="40" w:line="320"/>
+        <w:ind w:left="200"/>
+      </w:pPr>
+      <w:r>
+        <w:rPr>
+          <w:rFonts w:ascii="Arial" w:cs="Arial" w:eastAsia="Arial" w:hAnsi="Arial"/>
+          <w:sz w:val="22"/>
+          <w:szCs w:val="22"/>
+        </w:rPr>
+        <w:t xml:space="preserve">Learn the formula anywhere. When you want your real number, message me and we find it together.</w:t>
+      </w:r>
+    </w:p>
+    <w:p>
+      <w:pPr>
+        <w:spacing w:after="120"/>
+      </w:pPr>
+    </w:p>
+    <w:p>
+      <w:pPr>
+        <w:pStyle w:val="Heading3"/>
+        <w:spacing w:after="80" w:before="200"/>
+      </w:pPr>
+      <w:r>
+        <w:rPr>
+          <w:rFonts w:ascii="Arial" w:cs="Arial" w:eastAsia="Arial" w:hAnsi="Arial"/>
+          <w:b/>
+          <w:bCs/>
+          <w:color w:val="1A1A1A"/>
+          <w:sz w:val="24"/>
+          <w:szCs w:val="24"/>
+        </w:rPr>
+        <w:t xml:space="preserve">Taglish</w:t>
+      </w:r>
+    </w:p>
+    <w:p>
+      <w:pPr>
+        <w:pBdr>
+          <w:left w:val="single" w:color="0F2A4A" w:sz="18" w:space="10"/>
+        </w:pBdr>
+        <w:shd w:fill="FAFAFA" w:color="auto" w:val="clear"/>
+        <w:spacing w:after="20" w:before="60"/>
+        <w:ind w:left="200"/>
+      </w:pPr>
+      <w:r>
+        <w:rPr>
+          <w:rFonts w:ascii="Arial" w:cs="Arial" w:eastAsia="Arial" w:hAnsi="Arial"/>
+          <w:b/>
+          <w:bCs/>
+          <w:color w:val="0F2A4A"/>
+          <w:sz w:val="18"/>
+          <w:szCs w:val="18"/>
+        </w:rPr>
+        <w:t xml:space="preserve">[0:00 · Hook]</w:t>
+      </w:r>
+    </w:p>
+    <w:p>
+      <w:pPr>
+        <w:pBdr>
+          <w:left w:val="single" w:color="0F2A4A" w:sz="18" w:space="10"/>
+        </w:pBdr>
+        <w:shd w:fill="FAFAFA" w:color="auto" w:val="clear"/>
+        <w:spacing w:after="40" w:line="320"/>
+        <w:ind w:left="200"/>
+      </w:pPr>
+      <w:r>
+        <w:rPr>
+          <w:rFonts w:ascii="Arial" w:cs="Arial" w:eastAsia="Arial" w:hAnsi="Arial"/>
+          <w:sz w:val="22"/>
+          <w:szCs w:val="22"/>
+        </w:rPr>
+        <w:t xml:space="preserve">Kaya mong matutunan ang breakeven formula sa Google in five minutes.</w:t>
+      </w:r>
+    </w:p>
+    <w:p>
+      <w:pPr>
+        <w:pBdr>
+          <w:left w:val="single" w:color="0F2A4A" w:sz="18" w:space="10"/>
+        </w:pBdr>
+        <w:shd w:fill="FAFAFA" w:color="auto" w:val="clear"/>
+        <w:spacing w:after="40" w:line="320"/>
+        <w:ind w:left="200"/>
+      </w:pPr>
+      <w:r>
+        <w:rPr>
+          <w:rFonts w:ascii="Arial" w:cs="Arial" w:eastAsia="Arial" w:hAnsi="Arial"/>
+          <w:sz w:val="22"/>
+          <w:szCs w:val="22"/>
+        </w:rPr>
+        <w:t xml:space="preserve">Kaya ibibigay ko na sa'yo, libre, ngayon na.</w:t>
+      </w:r>
+    </w:p>
+    <w:p>
+      <w:pPr>
+        <w:spacing w:after="40"/>
+      </w:pPr>
+    </w:p>
+    <w:p>
+      <w:pPr>
+        <w:pBdr>
+          <w:left w:val="single" w:color="0F2A4A" w:sz="18" w:space="10"/>
+        </w:pBdr>
+        <w:shd w:fill="FAFAFA" w:color="auto" w:val="clear"/>
+        <w:spacing w:after="20" w:before="60"/>
+        <w:ind w:left="200"/>
+      </w:pPr>
+      <w:r>
+        <w:rPr>
+          <w:rFonts w:ascii="Arial" w:cs="Arial" w:eastAsia="Arial" w:hAnsi="Arial"/>
+          <w:b/>
+          <w:bCs/>
+          <w:color w:val="0F2A4A"/>
+          <w:sz w:val="18"/>
+          <w:szCs w:val="18"/>
+        </w:rPr>
+        <w:t xml:space="preserve">[0:06 · The formula]</w:t>
+      </w:r>
+    </w:p>
+    <w:p>
+      <w:pPr>
+        <w:pBdr>
+          <w:left w:val="single" w:color="0F2A4A" w:sz="18" w:space="10"/>
+        </w:pBdr>
+        <w:shd w:fill="FAFAFA" w:color="auto" w:val="clear"/>
+        <w:spacing w:after="40" w:line="320"/>
+        <w:ind w:left="200"/>
+      </w:pPr>
+      <w:r>
+        <w:rPr>
+          <w:rFonts w:ascii="Arial" w:cs="Arial" w:eastAsia="Arial" w:hAnsi="Arial"/>
+          <w:sz w:val="22"/>
+          <w:szCs w:val="22"/>
+        </w:rPr>
+        <w:t xml:space="preserve">Fixed costs, divided by ang presyo mo minus ang cost ng isang unit.</w:t>
+      </w:r>
+    </w:p>
+    <w:p>
+      <w:pPr>
+        <w:spacing w:after="40"/>
+      </w:pPr>
+    </w:p>
+    <w:p>
+      <w:pPr>
+        <w:pBdr>
+          <w:left w:val="single" w:color="0F2A4A" w:sz="18" w:space="10"/>
+        </w:pBdr>
+        <w:shd w:fill="FAFAFA" w:color="auto" w:val="clear"/>
+        <w:spacing w:after="20" w:before="60"/>
+        <w:ind w:left="200"/>
+      </w:pPr>
+      <w:r>
+        <w:rPr>
+          <w:rFonts w:ascii="Arial" w:cs="Arial" w:eastAsia="Arial" w:hAnsi="Arial"/>
+          <w:b/>
+          <w:bCs/>
+          <w:color w:val="0F2A4A"/>
+          <w:sz w:val="18"/>
+          <w:szCs w:val="18"/>
+        </w:rPr>
+        <w:t xml:space="preserve">[0:11 · Example]</w:t>
+      </w:r>
+    </w:p>
+    <w:p>
+      <w:pPr>
+        <w:pBdr>
+          <w:left w:val="single" w:color="0F2A4A" w:sz="18" w:space="10"/>
+        </w:pBdr>
+        <w:shd w:fill="FAFAFA" w:color="auto" w:val="clear"/>
+        <w:spacing w:after="40" w:line="320"/>
+        <w:ind w:left="200"/>
+      </w:pPr>
+      <w:r>
+        <w:rPr>
+          <w:rFonts w:ascii="Arial" w:cs="Arial" w:eastAsia="Arial" w:hAnsi="Arial"/>
+          <w:sz w:val="22"/>
+          <w:szCs w:val="22"/>
+        </w:rPr>
+        <w:t xml:space="preserve">Halimbawa lang. ₱30,000 a month ang renta, sweldo at bills mo.</w:t>
+      </w:r>
+    </w:p>
+    <w:p>
+      <w:pPr>
+        <w:pBdr>
+          <w:left w:val="single" w:color="0F2A4A" w:sz="18" w:space="10"/>
+        </w:pBdr>
+        <w:shd w:fill="FAFAFA" w:color="auto" w:val="clear"/>
+        <w:spacing w:after="40" w:line="320"/>
+        <w:ind w:left="200"/>
+      </w:pPr>
+      <w:r>
+        <w:rPr>
+          <w:rFonts w:ascii="Arial" w:cs="Arial" w:eastAsia="Arial" w:hAnsi="Arial"/>
+          <w:sz w:val="22"/>
+          <w:szCs w:val="22"/>
+        </w:rPr>
+        <w:t xml:space="preserve">Nagbebenta ka ng ₱100, at ₱70 ang puhunan sa bawat isa.</w:t>
+      </w:r>
+    </w:p>
+    <w:p>
+      <w:pPr>
+        <w:pBdr>
+          <w:left w:val="single" w:color="0F2A4A" w:sz="18" w:space="10"/>
+        </w:pBdr>
+        <w:shd w:fill="FAFAFA" w:color="auto" w:val="clear"/>
+        <w:spacing w:after="40" w:line="320"/>
+        <w:ind w:left="200"/>
+      </w:pPr>
+      <w:r>
+        <w:rPr>
+          <w:rFonts w:ascii="Arial" w:cs="Arial" w:eastAsia="Arial" w:hAnsi="Arial"/>
+          <w:sz w:val="22"/>
+          <w:szCs w:val="22"/>
+        </w:rPr>
+        <w:t xml:space="preserve">Kaya ₱30 ang naiiwan sa bawat benta. ₱30,000 divided by ₱30, 1,000 na benta.</w:t>
+      </w:r>
+    </w:p>
+    <w:p>
+      <w:pPr>
+        <w:pBdr>
+          <w:left w:val="single" w:color="0F2A4A" w:sz="18" w:space="10"/>
+        </w:pBdr>
+        <w:shd w:fill="FAFAFA" w:color="auto" w:val="clear"/>
+        <w:spacing w:after="40" w:line="320"/>
+        <w:ind w:left="200"/>
+      </w:pPr>
+      <w:r>
+        <w:rPr>
+          <w:rFonts w:ascii="Arial" w:cs="Arial" w:eastAsia="Arial" w:hAnsi="Arial"/>
+          <w:sz w:val="22"/>
+          <w:szCs w:val="22"/>
+        </w:rPr>
+        <w:t xml:space="preserve">'Yan ang breakeven mo.</w:t>
+      </w:r>
+    </w:p>
+    <w:p>
+      <w:pPr>
+        <w:spacing w:after="40"/>
+      </w:pPr>
+    </w:p>
+    <w:p>
+      <w:pPr>
+        <w:pBdr>
+          <w:left w:val="single" w:color="0F2A4A" w:sz="18" w:space="10"/>
+        </w:pBdr>
+        <w:shd w:fill="FAFAFA" w:color="auto" w:val="clear"/>
+        <w:spacing w:after="20" w:before="60"/>
+        <w:ind w:left="200"/>
+      </w:pPr>
+      <w:r>
+        <w:rPr>
+          <w:rFonts w:ascii="Arial" w:cs="Arial" w:eastAsia="Arial" w:hAnsi="Arial"/>
+          <w:b/>
+          <w:bCs/>
+          <w:color w:val="0F2A4A"/>
+          <w:sz w:val="18"/>
+          <w:szCs w:val="18"/>
+        </w:rPr>
+        <w:t xml:space="preserve">[0:26 · The turn]</w:t>
+      </w:r>
+    </w:p>
+    <w:p>
+      <w:pPr>
+        <w:pBdr>
+          <w:left w:val="single" w:color="0F2A4A" w:sz="18" w:space="10"/>
+        </w:pBdr>
+        <w:shd w:fill="FAFAFA" w:color="auto" w:val="clear"/>
+        <w:spacing w:after="40" w:line="320"/>
+        <w:ind w:left="200"/>
+      </w:pPr>
+      <w:r>
+        <w:rPr>
+          <w:rFonts w:ascii="Arial" w:cs="Arial" w:eastAsia="Arial" w:hAnsi="Arial"/>
+          <w:sz w:val="22"/>
+          <w:szCs w:val="22"/>
+        </w:rPr>
+        <w:t xml:space="preserve">Pero mahigit dalawampung kumpanya ang libro na dumaan sa desk ko buwan-buwan, at kahit kailan, hindi ang formula ang problema.</w:t>
+      </w:r>
+    </w:p>
+    <w:p>
+      <w:pPr>
+        <w:spacing w:after="40"/>
+      </w:pPr>
+    </w:p>
+    <w:p>
+      <w:pPr>
+        <w:pBdr>
+          <w:left w:val="single" w:color="0F2A4A" w:sz="18" w:space="10"/>
+        </w:pBdr>
+        <w:shd w:fill="FAFAFA" w:color="auto" w:val="clear"/>
+        <w:spacing w:after="20" w:before="60"/>
+        <w:ind w:left="200"/>
+      </w:pPr>
+      <w:r>
+        <w:rPr>
+          <w:rFonts w:ascii="Arial" w:cs="Arial" w:eastAsia="Arial" w:hAnsi="Arial"/>
+          <w:b/>
+          <w:bCs/>
+          <w:color w:val="0F2A4A"/>
+          <w:sz w:val="18"/>
+          <w:szCs w:val="18"/>
+        </w:rPr>
+        <w:t xml:space="preserve">[0:34 · The gap]</w:t>
+      </w:r>
+    </w:p>
+    <w:p>
+      <w:pPr>
+        <w:pBdr>
+          <w:left w:val="single" w:color="0F2A4A" w:sz="18" w:space="10"/>
+        </w:pBdr>
+        <w:shd w:fill="FAFAFA" w:color="auto" w:val="clear"/>
+        <w:spacing w:after="40" w:line="320"/>
+        <w:ind w:left="200"/>
+      </w:pPr>
+      <w:r>
+        <w:rPr>
+          <w:rFonts w:ascii="Arial" w:cs="Arial" w:eastAsia="Arial" w:hAnsi="Arial"/>
+          <w:sz w:val="22"/>
+          <w:szCs w:val="22"/>
+        </w:rPr>
+        <w:t xml:space="preserve">Ang problema, ang numerong ipinapasok dito.</w:t>
+      </w:r>
+    </w:p>
+    <w:p>
+      <w:pPr>
+        <w:pBdr>
+          <w:left w:val="single" w:color="0F2A4A" w:sz="18" w:space="10"/>
+        </w:pBdr>
+        <w:shd w:fill="FAFAFA" w:color="auto" w:val="clear"/>
+        <w:spacing w:after="40" w:line="320"/>
+        <w:ind w:left="200"/>
+      </w:pPr>
+      <w:r>
+        <w:rPr>
+          <w:rFonts w:ascii="Arial" w:cs="Arial" w:eastAsia="Arial" w:hAnsi="Arial"/>
+          <w:sz w:val="22"/>
+          <w:szCs w:val="22"/>
+        </w:rPr>
+        <w:t xml:space="preserve">'Yung ₱70 na ₱85 pala, kasi walang nagbilang ng delivery at ng mga nasisira.</w:t>
+      </w:r>
+    </w:p>
+    <w:p>
+      <w:pPr>
+        <w:pBdr>
+          <w:left w:val="single" w:color="0F2A4A" w:sz="18" w:space="10"/>
+        </w:pBdr>
+        <w:shd w:fill="FAFAFA" w:color="auto" w:val="clear"/>
+        <w:spacing w:after="40" w:line="320"/>
+        <w:ind w:left="200"/>
+      </w:pPr>
+      <w:r>
+        <w:rPr>
+          <w:rFonts w:ascii="Arial" w:cs="Arial" w:eastAsia="Arial" w:hAnsi="Arial"/>
+          <w:sz w:val="22"/>
+          <w:szCs w:val="22"/>
+        </w:rPr>
+        <w:t xml:space="preserve">'Yung sweldo ng owner mismo, hindi kailanman isinulat.</w:t>
+      </w:r>
+    </w:p>
+    <w:p>
+      <w:pPr>
+        <w:pBdr>
+          <w:left w:val="single" w:color="0F2A4A" w:sz="18" w:space="10"/>
+        </w:pBdr>
+        <w:shd w:fill="FAFAFA" w:color="auto" w:val="clear"/>
+        <w:spacing w:after="40" w:line="320"/>
+        <w:ind w:left="200"/>
+      </w:pPr>
+      <w:r>
+        <w:rPr>
+          <w:rFonts w:ascii="Arial" w:cs="Arial" w:eastAsia="Arial" w:hAnsi="Arial"/>
+          <w:sz w:val="22"/>
+          <w:szCs w:val="22"/>
+        </w:rPr>
+        <w:t xml:space="preserve">'Yung receivables na benta sa papel, pero hindi pa pera sa kamay.</w:t>
+      </w:r>
+    </w:p>
+    <w:p>
+      <w:pPr>
+        <w:pBdr>
+          <w:left w:val="single" w:color="0F2A4A" w:sz="18" w:space="10"/>
+        </w:pBdr>
+        <w:shd w:fill="FAFAFA" w:color="auto" w:val="clear"/>
+        <w:spacing w:after="40" w:line="320"/>
+        <w:ind w:left="200"/>
+      </w:pPr>
+      <w:r>
+        <w:rPr>
+          <w:rFonts w:ascii="Arial" w:cs="Arial" w:eastAsia="Arial" w:hAnsi="Arial"/>
+          <w:sz w:val="22"/>
+          <w:szCs w:val="22"/>
+        </w:rPr>
+        <w:t xml:space="preserve">At kapag ₱85 pala ang ₱70, ₱15 na lang ang naiiwan sa bawat benta. Ang breakeven mo, hindi 1,000. 2,000.</w:t>
+      </w:r>
+    </w:p>
+    <w:p>
+      <w:pPr>
+        <w:spacing w:after="40"/>
+      </w:pPr>
+    </w:p>
+    <w:p>
+      <w:pPr>
+        <w:pBdr>
+          <w:left w:val="single" w:color="0F2A4A" w:sz="18" w:space="10"/>
+        </w:pBdr>
+        <w:shd w:fill="FAFAFA" w:color="auto" w:val="clear"/>
+        <w:spacing w:after="20" w:before="60"/>
+        <w:ind w:left="200"/>
+      </w:pPr>
+      <w:r>
+        <w:rPr>
+          <w:rFonts w:ascii="Arial" w:cs="Arial" w:eastAsia="Arial" w:hAnsi="Arial"/>
+          <w:b/>
+          <w:bCs/>
+          <w:color w:val="0F2A4A"/>
+          <w:sz w:val="18"/>
+          <w:szCs w:val="18"/>
+        </w:rPr>
+        <w:t xml:space="preserve">[0:54 · Verdict]</w:t>
+      </w:r>
+    </w:p>
+    <w:p>
+      <w:pPr>
+        <w:pBdr>
+          <w:left w:val="single" w:color="0F2A4A" w:sz="18" w:space="10"/>
+        </w:pBdr>
+        <w:shd w:fill="FAFAFA" w:color="auto" w:val="clear"/>
+        <w:spacing w:after="40" w:line="320"/>
+        <w:ind w:left="200"/>
+      </w:pPr>
+      <w:r>
+        <w:rPr>
+          <w:rFonts w:ascii="Arial" w:cs="Arial" w:eastAsia="Arial" w:hAnsi="Arial"/>
+          <w:sz w:val="22"/>
+          <w:szCs w:val="22"/>
+        </w:rPr>
+        <w:t xml:space="preserve">Libre ang formula. Ang totoong numbers mo, hindi.</w:t>
+      </w:r>
+    </w:p>
+    <w:p>
+      <w:pPr>
+        <w:spacing w:after="40"/>
+      </w:pPr>
+    </w:p>
+    <w:p>
+      <w:pPr>
+        <w:pBdr>
+          <w:left w:val="single" w:color="0F2A4A" w:sz="18" w:space="10"/>
+        </w:pBdr>
+        <w:shd w:fill="FAFAFA" w:color="auto" w:val="clear"/>
+        <w:spacing w:after="20" w:before="60"/>
+        <w:ind w:left="200"/>
+      </w:pPr>
+      <w:r>
+        <w:rPr>
+          <w:rFonts w:ascii="Arial" w:cs="Arial" w:eastAsia="Arial" w:hAnsi="Arial"/>
+          <w:b/>
+          <w:bCs/>
+          <w:color w:val="0F2A4A"/>
+          <w:sz w:val="18"/>
+          <w:szCs w:val="18"/>
+        </w:rPr>
+        <w:t xml:space="preserve">[0:58 · What Google can't do]</w:t>
+      </w:r>
+    </w:p>
+    <w:p>
+      <w:pPr>
+        <w:pBdr>
+          <w:left w:val="single" w:color="0F2A4A" w:sz="18" w:space="10"/>
+        </w:pBdr>
+        <w:shd w:fill="FAFAFA" w:color="auto" w:val="clear"/>
+        <w:spacing w:after="40" w:line="320"/>
+        <w:ind w:left="200"/>
+      </w:pPr>
+      <w:r>
+        <w:rPr>
+          <w:rFonts w:ascii="Arial" w:cs="Arial" w:eastAsia="Arial" w:hAnsi="Arial"/>
+          <w:sz w:val="22"/>
+          <w:szCs w:val="22"/>
+        </w:rPr>
+        <w:t xml:space="preserve">At hindi kailanman titingnan ng Google ang libro mo para sabihing, "Huwag ka munang mangutang. Huwag ka munang mag-hire. Ayusin mo muna 'to."</w:t>
+      </w:r>
+    </w:p>
+    <w:p>
+      <w:pPr>
+        <w:pBdr>
+          <w:left w:val="single" w:color="0F2A4A" w:sz="18" w:space="10"/>
+        </w:pBdr>
+        <w:shd w:fill="FAFAFA" w:color="auto" w:val="clear"/>
+        <w:spacing w:after="40" w:line="320"/>
+        <w:ind w:left="200"/>
+      </w:pPr>
+      <w:r>
+        <w:rPr>
+          <w:rFonts w:ascii="Arial" w:cs="Arial" w:eastAsia="Arial" w:hAnsi="Arial"/>
+          <w:sz w:val="22"/>
+          <w:szCs w:val="22"/>
+        </w:rPr>
+        <w:t xml:space="preserve">'Yan ang sinabi ko sa client na gustong mangutang ng hanggang sampung milyong piso sa 5% a month. Binuksan nila sa akin ang libro nila, at inimbita nila ako sa board nila.</w:t>
+      </w:r>
+    </w:p>
+    <w:p>
+      <w:pPr>
+        <w:spacing w:after="40"/>
+      </w:pPr>
+    </w:p>
+    <w:p>
+      <w:pPr>
+        <w:pBdr>
+          <w:left w:val="single" w:color="0F2A4A" w:sz="18" w:space="10"/>
+        </w:pBdr>
+        <w:shd w:fill="FAFAFA" w:color="auto" w:val="clear"/>
+        <w:spacing w:after="20" w:before="60"/>
+        <w:ind w:left="200"/>
+      </w:pPr>
+      <w:r>
+        <w:rPr>
+          <w:rFonts w:ascii="Arial" w:cs="Arial" w:eastAsia="Arial" w:hAnsi="Arial"/>
+          <w:b/>
+          <w:bCs/>
+          <w:color w:val="0F2A4A"/>
+          <w:sz w:val="18"/>
+          <w:szCs w:val="18"/>
+        </w:rPr>
+        <w:t xml:space="preserve">[1:10 · CTA]</w:t>
+      </w:r>
+    </w:p>
+    <w:p>
+      <w:pPr>
+        <w:pBdr>
+          <w:left w:val="single" w:color="0F2A4A" w:sz="18" w:space="10"/>
+        </w:pBdr>
+        <w:shd w:fill="FAFAFA" w:color="auto" w:val="clear"/>
+        <w:spacing w:after="40" w:line="320"/>
+        <w:ind w:left="200"/>
+      </w:pPr>
+      <w:r>
+        <w:rPr>
+          <w:rFonts w:ascii="Arial" w:cs="Arial" w:eastAsia="Arial" w:hAnsi="Arial"/>
+          <w:sz w:val="22"/>
+          <w:szCs w:val="22"/>
+        </w:rPr>
+        <w:t xml:space="preserve">Matutunan mo ang formula kahit saan. Kapag gusto mo na ang totoong numero mo, message mo ako, sabay nating hahanapin.</w:t>
+      </w:r>
+    </w:p>
+    <w:p>
+      <w:pPr>
+        <w:spacing w:after="120"/>
+      </w:pPr>
+    </w:p>
+    <w:p>
+      <w:pPr>
+        <w:spacing w:after="100" w:line="300"/>
+      </w:pPr>
+      <w:r>
+        <w:rPr>
+          <w:rFonts w:ascii="Arial" w:cs="Arial" w:eastAsia="Arial" w:hAnsi="Arial"/>
+          <w:b/>
+          <w:bCs/>
+          <w:sz w:val="21"/>
+          <w:szCs w:val="21"/>
+        </w:rPr>
+        <w:t xml:space="preserve">Caption P.S.:</w:t>
+      </w:r>
+      <w:r>
+        <w:rPr>
+          <w:rFonts w:ascii="Arial" w:cs="Arial" w:eastAsia="Arial" w:hAnsi="Arial"/>
+          <w:sz w:val="21"/>
+          <w:szCs w:val="21"/>
+        </w:rPr>
+        <w:t xml:space="preserve"> The formula is free. The truth about your numbers is the work. / Libre ang formula. Ang katotohanan sa numbers mo, 'yan ang trabaho.</w:t>
+      </w:r>
+    </w:p>
+    <w:p>
+      <w:pPr>
+        <w:spacing w:after="100" w:line="300"/>
+      </w:pPr>
+      <w:r>
+        <w:rPr>
+          <w:rFonts w:ascii="Arial" w:cs="Arial" w:eastAsia="Arial" w:hAnsi="Arial"/>
+          <w:b/>
+          <w:bCs/>
+          <w:sz w:val="21"/>
+          <w:szCs w:val="21"/>
+        </w:rPr>
+        <w:t xml:space="preserve">Math check:</w:t>
+      </w:r>
+      <w:r>
+        <w:rPr>
+          <w:rFonts w:ascii="Arial" w:cs="Arial" w:eastAsia="Arial" w:hAnsi="Arial"/>
+          <w:sz w:val="21"/>
+          <w:szCs w:val="21"/>
+        </w:rPr>
+        <w:t xml:space="preserve"> ₱30,000 ÷ (₱100 − ₱70) = 1,000 sales. ₱30,000 ÷ (₱100 − ₱85) = 2,000 sales. Say "example only" on camera so no one takes it as their own number.</w:t>
+      </w:r>
+    </w:p>
+    <w:p>
+      <w:r>
+        <w:br w:type="page"/>
+      </w:r>
+    </w:p>
+    <w:p>
+      <w:pPr>
+        <w:pStyle w:val="Heading2"/>
+        <w:pBdr>
+          <w:bottom w:val="single" w:color="0F2A4A" w:sz="8" w:space="4"/>
         </w:pBdr>
         <w:spacing w:after="120" w:before="240"/>
       </w:pPr>
@@ -18117,7 +19770,403 @@
           <w:sz w:val="30"/>
           <w:szCs w:val="30"/>
         </w:rPr>
-        <w:t xml:space="preserve">Filming plan (batch all 12 in 2 sessions)</w:t>
+        <w:t xml:space="preserve">Testimonial Kit · Get 3 real client stories</w:t>
+      </w:r>
+    </w:p>
+    <w:p>
+      <w:pPr>
+        <w:spacing w:after="100" w:line="300"/>
+      </w:pPr>
+      <w:r>
+        <w:rPr>
+          <w:rFonts w:ascii="Arial" w:cs="Arial" w:eastAsia="Arial" w:hAnsi="Arial"/>
+          <w:b/>
+          <w:bCs/>
+          <w:sz w:val="21"/>
+          <w:szCs w:val="21"/>
+        </w:rPr>
+        <w:t xml:space="preserve">Why this matters most:</w:t>
+      </w:r>
+      <w:r>
+        <w:rPr>
+          <w:rFonts w:ascii="Arial" w:cs="Arial" w:eastAsia="Arial" w:hAnsi="Arial"/>
+          <w:sz w:val="21"/>
+          <w:szCs w:val="21"/>
+        </w:rPr>
+        <w:t xml:space="preserve"> Gilbert's files have strong personal stories but </w:t>
+      </w:r>
+      <w:r>
+        <w:rPr>
+          <w:rFonts w:ascii="Arial" w:cs="Arial" w:eastAsia="Arial" w:hAnsi="Arial"/>
+          <w:b/>
+          <w:bCs/>
+          <w:sz w:val="21"/>
+          <w:szCs w:val="21"/>
+        </w:rPr>
+        <w:t xml:space="preserve">no client testimonials</w:t>
+      </w:r>
+      <w:r>
+        <w:rPr>
+          <w:rFonts w:ascii="Arial" w:cs="Arial" w:eastAsia="Arial" w:hAnsi="Arial"/>
+          <w:sz w:val="21"/>
+          <w:szCs w:val="21"/>
+        </w:rPr>
+        <w:t xml:space="preserve">. When someone asks </w:t>
+      </w:r>
+      <w:r>
+        <w:rPr>
+          <w:rFonts w:ascii="Arial" w:cs="Arial" w:eastAsia="Arial" w:hAnsi="Arial"/>
+          <w:i/>
+          <w:iCs/>
+          <w:sz w:val="21"/>
+          <w:szCs w:val="21"/>
+        </w:rPr>
+        <w:t xml:space="preserve">"Why should I believe you?"</w:t>
+      </w:r>
+      <w:r>
+        <w:rPr>
+          <w:rFonts w:ascii="Arial" w:cs="Arial" w:eastAsia="Arial" w:hAnsi="Arial"/>
+          <w:sz w:val="21"/>
+          <w:szCs w:val="21"/>
+        </w:rPr>
+        <w:t xml:space="preserve">, the strongest answer is another owner like them saying </w:t>
+      </w:r>
+      <w:r>
+        <w:rPr>
+          <w:rFonts w:ascii="Arial" w:cs="Arial" w:eastAsia="Arial" w:hAnsi="Arial"/>
+          <w:i/>
+          <w:iCs/>
+          <w:sz w:val="21"/>
+          <w:szCs w:val="21"/>
+        </w:rPr>
+        <w:t xml:space="preserve">"This worked for me."</w:t>
+      </w:r>
+      <w:r>
+        <w:rPr>
+          <w:rFonts w:ascii="Arial" w:cs="Arial" w:eastAsia="Arial" w:hAnsi="Arial"/>
+          <w:sz w:val="21"/>
+          <w:szCs w:val="21"/>
+        </w:rPr>
+        <w:t xml:space="preserve"> Aim for 3 in the next 30 days.</w:t>
+      </w:r>
+    </w:p>
+    <w:p>
+      <w:pPr>
+        <w:pStyle w:val="Heading3"/>
+        <w:spacing w:after="80" w:before="200"/>
+      </w:pPr>
+      <w:r>
+        <w:rPr>
+          <w:rFonts w:ascii="Arial" w:cs="Arial" w:eastAsia="Arial" w:hAnsi="Arial"/>
+          <w:b/>
+          <w:bCs/>
+          <w:color w:val="1A1A1A"/>
+          <w:sz w:val="24"/>
+          <w:szCs w:val="24"/>
+        </w:rPr>
+        <w:t xml:space="preserve">Step 1 · Choose who to ask</w:t>
+      </w:r>
+    </w:p>
+    <w:p>
+      <w:pPr>
+        <w:pStyle w:val="ListParagraph"/>
+        <w:numPr>
+          <w:ilvl w:val="0"/>
+          <w:numId w:val="3"/>
+        </w:numPr>
+        <w:spacing w:after="60"/>
+      </w:pPr>
+      <w:r>
+        <w:rPr>
+          <w:rFonts w:ascii="Arial" w:cs="Arial" w:eastAsia="Arial" w:hAnsi="Arial"/>
+          <w:sz w:val="21"/>
+          <w:szCs w:val="21"/>
+        </w:rPr>
+        <w:t xml:space="preserve">Pick </w:t>
+      </w:r>
+      <w:r>
+        <w:rPr>
+          <w:rFonts w:ascii="Arial" w:cs="Arial" w:eastAsia="Arial" w:hAnsi="Arial"/>
+          <w:b/>
+          <w:bCs/>
+          <w:sz w:val="21"/>
+          <w:szCs w:val="21"/>
+        </w:rPr>
+        <w:t xml:space="preserve">3 people</w:t>
+      </w:r>
+      <w:r>
+        <w:rPr>
+          <w:rFonts w:ascii="Arial" w:cs="Arial" w:eastAsia="Arial" w:hAnsi="Arial"/>
+          <w:sz w:val="21"/>
+          <w:szCs w:val="21"/>
+        </w:rPr>
+        <w:t xml:space="preserve"> who got a real number or made a real decision with Gilbert's help. They can be mentorship clients, BRO Lending clients, interns, or Cash Flow game players.</w:t>
+      </w:r>
+    </w:p>
+    <w:p>
+      <w:pPr>
+        <w:pStyle w:val="ListParagraph"/>
+        <w:numPr>
+          <w:ilvl w:val="0"/>
+          <w:numId w:val="3"/>
+        </w:numPr>
+        <w:spacing w:after="60"/>
+      </w:pPr>
+      <w:r>
+        <w:rPr>
+          <w:rFonts w:ascii="Arial" w:cs="Arial" w:eastAsia="Arial" w:hAnsi="Arial"/>
+          <w:sz w:val="21"/>
+          <w:szCs w:val="21"/>
+        </w:rPr>
+        <w:t xml:space="preserve">Ask </w:t>
+      </w:r>
+      <w:r>
+        <w:rPr>
+          <w:rFonts w:ascii="Arial" w:cs="Arial" w:eastAsia="Arial" w:hAnsi="Arial"/>
+          <w:b/>
+          <w:bCs/>
+          <w:sz w:val="21"/>
+          <w:szCs w:val="21"/>
+        </w:rPr>
+        <w:t xml:space="preserve">right after a win</w:t>
+      </w:r>
+      <w:r>
+        <w:rPr>
+          <w:rFonts w:ascii="Arial" w:cs="Arial" w:eastAsia="Arial" w:hAnsi="Arial"/>
+          <w:sz w:val="21"/>
+          <w:szCs w:val="21"/>
+        </w:rPr>
+        <w:t xml:space="preserve">, while the feeling is fresh: the week they found their break-even, avoided a bad loan, or saw cash settle for the first time.</w:t>
+      </w:r>
+    </w:p>
+    <w:p>
+      <w:pPr>
+        <w:pStyle w:val="ListParagraph"/>
+        <w:numPr>
+          <w:ilvl w:val="0"/>
+          <w:numId w:val="3"/>
+        </w:numPr>
+        <w:spacing w:after="60"/>
+      </w:pPr>
+      <w:r>
+        <w:rPr>
+          <w:rFonts w:ascii="Arial" w:cs="Arial" w:eastAsia="Arial" w:hAnsi="Arial"/>
+          <w:b/>
+          <w:bCs/>
+          <w:sz w:val="21"/>
+          <w:szCs w:val="21"/>
+        </w:rPr>
+        <w:t xml:space="preserve">No clients yet?</w:t>
+      </w:r>
+      <w:r>
+        <w:rPr>
+          <w:rFonts w:ascii="Arial" w:cs="Arial" w:eastAsia="Arial" w:hAnsi="Arial"/>
+          <w:sz w:val="21"/>
+          <w:szCs w:val="21"/>
+        </w:rPr>
+        <w:t xml:space="preserve"> Offer 3 owners a free "First Number" session in exchange for honest feedback. Tell them this upfront. That's a fair trade for both sides, not a trick.</w:t>
+      </w:r>
+    </w:p>
+    <w:p>
+      <w:pPr>
+        <w:pStyle w:val="Heading3"/>
+        <w:spacing w:after="80" w:before="200"/>
+      </w:pPr>
+      <w:r>
+        <w:rPr>
+          <w:rFonts w:ascii="Arial" w:cs="Arial" w:eastAsia="Arial" w:hAnsi="Arial"/>
+          <w:b/>
+          <w:bCs/>
+          <w:color w:val="1A1A1A"/>
+          <w:sz w:val="24"/>
+          <w:szCs w:val="24"/>
+        </w:rPr>
+        <w:t xml:space="preserve">Step 2 · Send the request (Messenger or Viber)</w:t>
+      </w:r>
+    </w:p>
+    <w:p>
+      <w:pPr>
+        <w:spacing w:after="100" w:line="300"/>
+      </w:pPr>
+      <w:r>
+        <w:rPr>
+          <w:rFonts w:ascii="Arial" w:cs="Arial" w:eastAsia="Arial" w:hAnsi="Arial"/>
+          <w:b/>
+          <w:bCs/>
+          <w:sz w:val="21"/>
+          <w:szCs w:val="21"/>
+        </w:rPr>
+        <w:t xml:space="preserve">English</w:t>
+      </w:r>
+    </w:p>
+    <w:p>
+      <w:pPr>
+        <w:pBdr>
+          <w:left w:val="single" w:color="0F2A4A" w:sz="18" w:space="10"/>
+        </w:pBdr>
+        <w:shd w:fill="FAFAFA" w:color="auto" w:val="clear"/>
+        <w:spacing w:after="40" w:line="320"/>
+        <w:ind w:left="200"/>
+      </w:pPr>
+      <w:r>
+        <w:rPr>
+          <w:rFonts w:ascii="Arial" w:cs="Arial" w:eastAsia="Arial" w:hAnsi="Arial"/>
+          <w:sz w:val="22"/>
+          <w:szCs w:val="22"/>
+        </w:rPr>
+        <w:t xml:space="preserve">Hi [Name], this is Gilbert. It's been [time] since we worked on your [break-even / cash flow / loan decision]. Thank you for trusting me with your numbers.</w:t>
+      </w:r>
+    </w:p>
+    <w:p>
+      <w:pPr>
+        <w:spacing w:after="40"/>
+      </w:pPr>
+    </w:p>
+    <w:p>
+      <w:pPr>
+        <w:pBdr>
+          <w:left w:val="single" w:color="0F2A4A" w:sz="18" w:space="10"/>
+        </w:pBdr>
+        <w:shd w:fill="FAFAFA" w:color="auto" w:val="clear"/>
+        <w:spacing w:after="40" w:line="320"/>
+        <w:ind w:left="200"/>
+      </w:pPr>
+      <w:r>
+        <w:rPr>
+          <w:rFonts w:ascii="Arial" w:cs="Arial" w:eastAsia="Arial" w:hAnsi="Arial"/>
+          <w:sz w:val="22"/>
+          <w:szCs w:val="22"/>
+        </w:rPr>
+        <w:t xml:space="preserve">Can I ask a small favor? I'm sharing real stories so other owners can see that knowing the numbers works. Would you answer 5 short questions? Text, voice note or a 30-second video, whatever is easiest for you.</w:t>
+      </w:r>
+    </w:p>
+    <w:p>
+      <w:pPr>
+        <w:spacing w:after="40"/>
+      </w:pPr>
+    </w:p>
+    <w:p>
+      <w:pPr>
+        <w:pBdr>
+          <w:left w:val="single" w:color="0F2A4A" w:sz="18" w:space="10"/>
+        </w:pBdr>
+        <w:shd w:fill="FAFAFA" w:color="auto" w:val="clear"/>
+        <w:spacing w:after="40" w:line="320"/>
+        <w:ind w:left="200"/>
+      </w:pPr>
+      <w:r>
+        <w:rPr>
+          <w:rFonts w:ascii="Arial" w:cs="Arial" w:eastAsia="Arial" w:hAnsi="Arial"/>
+          <w:sz w:val="22"/>
+          <w:szCs w:val="22"/>
+        </w:rPr>
+        <w:t xml:space="preserve">You decide how I use it: full name and photo, first name and type of business only, or no name at all. And if you'd rather not, that is completely fine. Salamat, [Name].</w:t>
+      </w:r>
+    </w:p>
+    <w:p>
+      <w:pPr>
+        <w:spacing w:after="120"/>
+      </w:pPr>
+    </w:p>
+    <w:p>
+      <w:pPr>
+        <w:spacing w:after="100" w:line="300"/>
+      </w:pPr>
+      <w:r>
+        <w:rPr>
+          <w:rFonts w:ascii="Arial" w:cs="Arial" w:eastAsia="Arial" w:hAnsi="Arial"/>
+          <w:b/>
+          <w:bCs/>
+          <w:sz w:val="21"/>
+          <w:szCs w:val="21"/>
+        </w:rPr>
+        <w:t xml:space="preserve">Taglish</w:t>
+      </w:r>
+    </w:p>
+    <w:p>
+      <w:pPr>
+        <w:pBdr>
+          <w:left w:val="single" w:color="0F2A4A" w:sz="18" w:space="10"/>
+        </w:pBdr>
+        <w:shd w:fill="FAFAFA" w:color="auto" w:val="clear"/>
+        <w:spacing w:after="40" w:line="320"/>
+        <w:ind w:left="200"/>
+      </w:pPr>
+      <w:r>
+        <w:rPr>
+          <w:rFonts w:ascii="Arial" w:cs="Arial" w:eastAsia="Arial" w:hAnsi="Arial"/>
+          <w:sz w:val="22"/>
+          <w:szCs w:val="22"/>
+        </w:rPr>
+        <w:t xml:space="preserve">Hi [Name], si Gilbert 'to. [Time] na mula nung inayos natin ang [breakeven / cash flow / desisyon sa loan] mo. Salamat sa tiwala mo sa numbers mo.</w:t>
+      </w:r>
+    </w:p>
+    <w:p>
+      <w:pPr>
+        <w:spacing w:after="40"/>
+      </w:pPr>
+    </w:p>
+    <w:p>
+      <w:pPr>
+        <w:pBdr>
+          <w:left w:val="single" w:color="0F2A4A" w:sz="18" w:space="10"/>
+        </w:pBdr>
+        <w:shd w:fill="FAFAFA" w:color="auto" w:val="clear"/>
+        <w:spacing w:after="40" w:line="320"/>
+        <w:ind w:left="200"/>
+      </w:pPr>
+      <w:r>
+        <w:rPr>
+          <w:rFonts w:ascii="Arial" w:cs="Arial" w:eastAsia="Arial" w:hAnsi="Arial"/>
+          <w:sz w:val="22"/>
+          <w:szCs w:val="22"/>
+        </w:rPr>
+        <w:t xml:space="preserve">Pwede ba akong humingi ng maliit na pabor? Nagbabahagi ako ng totoong kwento para makita ng ibang owners na gumagana talaga ang pag-alam sa numbers. Pwede mo bang sagutin ang 5 maikling tanong? Text, voice note, o 30-second video, kung ano ang pinakamadali sa'yo.</w:t>
+      </w:r>
+    </w:p>
+    <w:p>
+      <w:pPr>
+        <w:spacing w:after="40"/>
+      </w:pPr>
+    </w:p>
+    <w:p>
+      <w:pPr>
+        <w:pBdr>
+          <w:left w:val="single" w:color="0F2A4A" w:sz="18" w:space="10"/>
+        </w:pBdr>
+        <w:shd w:fill="FAFAFA" w:color="auto" w:val="clear"/>
+        <w:spacing w:after="40" w:line="320"/>
+        <w:ind w:left="200"/>
+      </w:pPr>
+      <w:r>
+        <w:rPr>
+          <w:rFonts w:ascii="Arial" w:cs="Arial" w:eastAsia="Arial" w:hAnsi="Arial"/>
+          <w:sz w:val="22"/>
+          <w:szCs w:val="22"/>
+        </w:rPr>
+        <w:t xml:space="preserve">Ikaw ang bahala kung paano ko gagamitin: full name at photo, first name at klase ng negosyo lang, o walang pangalan. At kung ayaw mo, okay lang talaga. Salamat, [Name].</w:t>
+      </w:r>
+    </w:p>
+    <w:p>
+      <w:pPr>
+        <w:spacing w:after="120"/>
+      </w:pPr>
+    </w:p>
+    <w:p>
+      <w:pPr>
+        <w:pStyle w:val="Heading3"/>
+        <w:spacing w:after="80" w:before="200"/>
+      </w:pPr>
+      <w:r>
+        <w:rPr>
+          <w:rFonts w:ascii="Arial" w:cs="Arial" w:eastAsia="Arial" w:hAnsi="Arial"/>
+          <w:b/>
+          <w:bCs/>
+          <w:color w:val="1A1A1A"/>
+          <w:sz w:val="24"/>
+          <w:szCs w:val="24"/>
+        </w:rPr>
+        <w:t xml:space="preserve">Step 3 · Ask these 5 questions</w:t>
       </w:r>
     </w:p>
     <w:tbl>
@@ -18146,7 +20195,1085 @@
         <w:tc>
           <w:tcPr>
             <w:tcW w:type="dxa" w:w="1735"/>
-            <w:shd w:fill="E90D41" w:color="auto" w:val="clear"/>
+            <w:shd w:fill="0F2A4A" w:color="auto" w:val="clear"/>
+            <w:tcMar>
+              <w:top w:type="dxa" w:w="80"/>
+              <w:left w:type="dxa" w:w="110"/>
+              <w:bottom w:type="dxa" w:w="80"/>
+              <w:right w:type="dxa" w:w="110"/>
+            </w:tcMar>
+          </w:tcPr>
+          <w:p>
+            <w:r>
+              <w:rPr>
+                <w:rFonts w:ascii="Arial" w:cs="Arial" w:eastAsia="Arial" w:hAnsi="Arial"/>
+                <w:b/>
+                <w:bCs/>
+                <w:color w:val="FFFFFF"/>
+                <w:sz w:val="19"/>
+                <w:szCs w:val="19"/>
+              </w:rPr>
+              <w:t xml:space="preserve">#</w:t>
+            </w:r>
+          </w:p>
+        </w:tc>
+        <w:tc>
+          <w:tcPr>
+            <w:tcW w:type="dxa" w:w="2120"/>
+            <w:shd w:fill="0F2A4A" w:color="auto" w:val="clear"/>
+            <w:tcMar>
+              <w:top w:type="dxa" w:w="80"/>
+              <w:left w:type="dxa" w:w="110"/>
+              <w:bottom w:type="dxa" w:w="80"/>
+              <w:right w:type="dxa" w:w="110"/>
+            </w:tcMar>
+          </w:tcPr>
+          <w:p>
+            <w:r>
+              <w:rPr>
+                <w:rFonts w:ascii="Arial" w:cs="Arial" w:eastAsia="Arial" w:hAnsi="Arial"/>
+                <w:b/>
+                <w:bCs/>
+                <w:color w:val="FFFFFF"/>
+                <w:sz w:val="19"/>
+                <w:szCs w:val="19"/>
+              </w:rPr>
+              <w:t xml:space="preserve">English</w:t>
+            </w:r>
+          </w:p>
+        </w:tc>
+        <w:tc>
+          <w:tcPr>
+            <w:tcW w:type="dxa" w:w="4048"/>
+            <w:shd w:fill="0F2A4A" w:color="auto" w:val="clear"/>
+            <w:tcMar>
+              <w:top w:type="dxa" w:w="80"/>
+              <w:left w:type="dxa" w:w="110"/>
+              <w:bottom w:type="dxa" w:w="80"/>
+              <w:right w:type="dxa" w:w="110"/>
+            </w:tcMar>
+          </w:tcPr>
+          <w:p>
+            <w:r>
+              <w:rPr>
+                <w:rFonts w:ascii="Arial" w:cs="Arial" w:eastAsia="Arial" w:hAnsi="Arial"/>
+                <w:b/>
+                <w:bCs/>
+                <w:color w:val="FFFFFF"/>
+                <w:sz w:val="19"/>
+                <w:szCs w:val="19"/>
+              </w:rPr>
+              <w:t xml:space="preserve">Taglish</w:t>
+            </w:r>
+          </w:p>
+        </w:tc>
+        <w:tc>
+          <w:tcPr>
+            <w:tcW w:type="dxa" w:w="1735"/>
+            <w:shd w:fill="0F2A4A" w:color="auto" w:val="clear"/>
+            <w:tcMar>
+              <w:top w:type="dxa" w:w="80"/>
+              <w:left w:type="dxa" w:w="110"/>
+              <w:bottom w:type="dxa" w:w="80"/>
+              <w:right w:type="dxa" w:w="110"/>
+            </w:tcMar>
+          </w:tcPr>
+          <w:p>
+            <w:r>
+              <w:rPr>
+                <w:rFonts w:ascii="Arial" w:cs="Arial" w:eastAsia="Arial" w:hAnsi="Arial"/>
+                <w:b/>
+                <w:bCs/>
+                <w:color w:val="FFFFFF"/>
+                <w:sz w:val="19"/>
+                <w:szCs w:val="19"/>
+              </w:rPr>
+              <w:t xml:space="preserve">Why it works</w:t>
+            </w:r>
+          </w:p>
+        </w:tc>
+      </w:tr>
+      <w:tr>
+        <w:tc>
+          <w:tcPr>
+            <w:tcW w:type="dxa" w:w="1735"/>
+            <w:tcMar>
+              <w:top w:type="dxa" w:w="80"/>
+              <w:left w:type="dxa" w:w="110"/>
+              <w:bottom w:type="dxa" w:w="80"/>
+              <w:right w:type="dxa" w:w="110"/>
+            </w:tcMar>
+          </w:tcPr>
+          <w:p>
+            <w:r>
+              <w:rPr>
+                <w:rFonts w:ascii="Arial" w:cs="Arial" w:eastAsia="Arial" w:hAnsi="Arial"/>
+                <w:b w:val="false"/>
+                <w:bCs w:val="false"/>
+                <w:color w:val="1A1A1A"/>
+                <w:sz w:val="19"/>
+                <w:szCs w:val="19"/>
+              </w:rPr>
+              <w:t xml:space="preserve">1</w:t>
+            </w:r>
+          </w:p>
+        </w:tc>
+        <w:tc>
+          <w:tcPr>
+            <w:tcW w:type="dxa" w:w="2120"/>
+            <w:tcMar>
+              <w:top w:type="dxa" w:w="80"/>
+              <w:left w:type="dxa" w:w="110"/>
+              <w:bottom w:type="dxa" w:w="80"/>
+              <w:right w:type="dxa" w:w="110"/>
+            </w:tcMar>
+          </w:tcPr>
+          <w:p>
+            <w:r>
+              <w:rPr>
+                <w:rFonts w:ascii="Arial" w:cs="Arial" w:eastAsia="Arial" w:hAnsi="Arial"/>
+                <w:b w:val="false"/>
+                <w:bCs w:val="false"/>
+                <w:color w:val="1A1A1A"/>
+                <w:sz w:val="19"/>
+                <w:szCs w:val="19"/>
+              </w:rPr>
+              <w:t xml:space="preserve">Before we worked together, what was going on with your numbers?</w:t>
+            </w:r>
+          </w:p>
+        </w:tc>
+        <w:tc>
+          <w:tcPr>
+            <w:tcW w:type="dxa" w:w="4048"/>
+            <w:tcMar>
+              <w:top w:type="dxa" w:w="80"/>
+              <w:left w:type="dxa" w:w="110"/>
+              <w:bottom w:type="dxa" w:w="80"/>
+              <w:right w:type="dxa" w:w="110"/>
+            </w:tcMar>
+          </w:tcPr>
+          <w:p>
+            <w:r>
+              <w:rPr>
+                <w:rFonts w:ascii="Arial" w:cs="Arial" w:eastAsia="Arial" w:hAnsi="Arial"/>
+                <w:b w:val="false"/>
+                <w:bCs w:val="false"/>
+                <w:color w:val="1A1A1A"/>
+                <w:sz w:val="19"/>
+                <w:szCs w:val="19"/>
+              </w:rPr>
+              <w:t xml:space="preserve">Bago tayo nagtrabaho, ano ang sitwasyon ng numbers mo?</w:t>
+            </w:r>
+          </w:p>
+        </w:tc>
+        <w:tc>
+          <w:tcPr>
+            <w:tcW w:type="dxa" w:w="1735"/>
+            <w:tcMar>
+              <w:top w:type="dxa" w:w="80"/>
+              <w:left w:type="dxa" w:w="110"/>
+              <w:bottom w:type="dxa" w:w="80"/>
+              <w:right w:type="dxa" w:w="110"/>
+            </w:tcMar>
+          </w:tcPr>
+          <w:p>
+            <w:r>
+              <w:rPr>
+                <w:rFonts w:ascii="Arial" w:cs="Arial" w:eastAsia="Arial" w:hAnsi="Arial"/>
+                <w:b w:val="false"/>
+                <w:bCs w:val="false"/>
+                <w:color w:val="1A1A1A"/>
+                <w:sz w:val="19"/>
+                <w:szCs w:val="19"/>
+              </w:rPr>
+              <w:t xml:space="preserve">Shows the "before"</w:t>
+            </w:r>
+          </w:p>
+        </w:tc>
+      </w:tr>
+      <w:tr>
+        <w:tc>
+          <w:tcPr>
+            <w:tcW w:type="dxa" w:w="1735"/>
+            <w:shd w:fill="F6F6F6" w:color="auto" w:val="clear"/>
+            <w:tcMar>
+              <w:top w:type="dxa" w:w="80"/>
+              <w:left w:type="dxa" w:w="110"/>
+              <w:bottom w:type="dxa" w:w="80"/>
+              <w:right w:type="dxa" w:w="110"/>
+            </w:tcMar>
+          </w:tcPr>
+          <w:p>
+            <w:r>
+              <w:rPr>
+                <w:rFonts w:ascii="Arial" w:cs="Arial" w:eastAsia="Arial" w:hAnsi="Arial"/>
+                <w:b w:val="false"/>
+                <w:bCs w:val="false"/>
+                <w:color w:val="1A1A1A"/>
+                <w:sz w:val="19"/>
+                <w:szCs w:val="19"/>
+              </w:rPr>
+              <w:t xml:space="preserve">2</w:t>
+            </w:r>
+          </w:p>
+        </w:tc>
+        <w:tc>
+          <w:tcPr>
+            <w:tcW w:type="dxa" w:w="2120"/>
+            <w:shd w:fill="F6F6F6" w:color="auto" w:val="clear"/>
+            <w:tcMar>
+              <w:top w:type="dxa" w:w="80"/>
+              <w:left w:type="dxa" w:w="110"/>
+              <w:bottom w:type="dxa" w:w="80"/>
+              <w:right w:type="dxa" w:w="110"/>
+            </w:tcMar>
+          </w:tcPr>
+          <w:p>
+            <w:r>
+              <w:rPr>
+                <w:rFonts w:ascii="Arial" w:cs="Arial" w:eastAsia="Arial" w:hAnsi="Arial"/>
+                <w:b w:val="false"/>
+                <w:bCs w:val="false"/>
+                <w:color w:val="1A1A1A"/>
+                <w:sz w:val="19"/>
+                <w:szCs w:val="19"/>
+              </w:rPr>
+              <w:t xml:space="preserve">What made you hesitate before reaching out?</w:t>
+            </w:r>
+          </w:p>
+        </w:tc>
+        <w:tc>
+          <w:tcPr>
+            <w:tcW w:type="dxa" w:w="4048"/>
+            <w:shd w:fill="F6F6F6" w:color="auto" w:val="clear"/>
+            <w:tcMar>
+              <w:top w:type="dxa" w:w="80"/>
+              <w:left w:type="dxa" w:w="110"/>
+              <w:bottom w:type="dxa" w:w="80"/>
+              <w:right w:type="dxa" w:w="110"/>
+            </w:tcMar>
+          </w:tcPr>
+          <w:p>
+            <w:r>
+              <w:rPr>
+                <w:rFonts w:ascii="Arial" w:cs="Arial" w:eastAsia="Arial" w:hAnsi="Arial"/>
+                <w:b w:val="false"/>
+                <w:bCs w:val="false"/>
+                <w:color w:val="1A1A1A"/>
+                <w:sz w:val="19"/>
+                <w:szCs w:val="19"/>
+              </w:rPr>
+              <w:t xml:space="preserve">Ano ang nagpaalangan sa'yo bago ka lumapit?</w:t>
+            </w:r>
+          </w:p>
+        </w:tc>
+        <w:tc>
+          <w:tcPr>
+            <w:tcW w:type="dxa" w:w="1735"/>
+            <w:shd w:fill="F6F6F6" w:color="auto" w:val="clear"/>
+            <w:tcMar>
+              <w:top w:type="dxa" w:w="80"/>
+              <w:left w:type="dxa" w:w="110"/>
+              <w:bottom w:type="dxa" w:w="80"/>
+              <w:right w:type="dxa" w:w="110"/>
+            </w:tcMar>
+          </w:tcPr>
+          <w:p>
+            <w:r>
+              <w:rPr>
+                <w:rFonts w:ascii="Arial" w:cs="Arial" w:eastAsia="Arial" w:hAnsi="Arial"/>
+                <w:b w:val="false"/>
+                <w:bCs w:val="false"/>
+                <w:color w:val="1A1A1A"/>
+                <w:sz w:val="19"/>
+                <w:szCs w:val="19"/>
+              </w:rPr>
+              <w:t xml:space="preserve">Their doubt answers the next person's doubt</w:t>
+            </w:r>
+          </w:p>
+        </w:tc>
+      </w:tr>
+      <w:tr>
+        <w:tc>
+          <w:tcPr>
+            <w:tcW w:type="dxa" w:w="1735"/>
+            <w:tcMar>
+              <w:top w:type="dxa" w:w="80"/>
+              <w:left w:type="dxa" w:w="110"/>
+              <w:bottom w:type="dxa" w:w="80"/>
+              <w:right w:type="dxa" w:w="110"/>
+            </w:tcMar>
+          </w:tcPr>
+          <w:p>
+            <w:r>
+              <w:rPr>
+                <w:rFonts w:ascii="Arial" w:cs="Arial" w:eastAsia="Arial" w:hAnsi="Arial"/>
+                <w:b w:val="false"/>
+                <w:bCs w:val="false"/>
+                <w:color w:val="1A1A1A"/>
+                <w:sz w:val="19"/>
+                <w:szCs w:val="19"/>
+              </w:rPr>
+              <w:t xml:space="preserve">3</w:t>
+            </w:r>
+          </w:p>
+        </w:tc>
+        <w:tc>
+          <w:tcPr>
+            <w:tcW w:type="dxa" w:w="2120"/>
+            <w:tcMar>
+              <w:top w:type="dxa" w:w="80"/>
+              <w:left w:type="dxa" w:w="110"/>
+              <w:bottom w:type="dxa" w:w="80"/>
+              <w:right w:type="dxa" w:w="110"/>
+            </w:tcMar>
+          </w:tcPr>
+          <w:p>
+            <w:r>
+              <w:rPr>
+                <w:rFonts w:ascii="Arial" w:cs="Arial" w:eastAsia="Arial" w:hAnsi="Arial"/>
+                <w:b w:val="false"/>
+                <w:bCs w:val="false"/>
+                <w:color w:val="1A1A1A"/>
+                <w:sz w:val="19"/>
+                <w:szCs w:val="19"/>
+              </w:rPr>
+              <w:t xml:space="preserve">What number did we find? Give the exact ₱ if you're comfortable.</w:t>
+            </w:r>
+          </w:p>
+        </w:tc>
+        <w:tc>
+          <w:tcPr>
+            <w:tcW w:type="dxa" w:w="4048"/>
+            <w:tcMar>
+              <w:top w:type="dxa" w:w="80"/>
+              <w:left w:type="dxa" w:w="110"/>
+              <w:bottom w:type="dxa" w:w="80"/>
+              <w:right w:type="dxa" w:w="110"/>
+            </w:tcMar>
+          </w:tcPr>
+          <w:p>
+            <w:r>
+              <w:rPr>
+                <w:rFonts w:ascii="Arial" w:cs="Arial" w:eastAsia="Arial" w:hAnsi="Arial"/>
+                <w:b w:val="false"/>
+                <w:bCs w:val="false"/>
+                <w:color w:val="1A1A1A"/>
+                <w:sz w:val="19"/>
+                <w:szCs w:val="19"/>
+              </w:rPr>
+              <w:t xml:space="preserve">Anong numero ang nahanap natin? Exact ₱ kung komportable ka.</w:t>
+            </w:r>
+          </w:p>
+        </w:tc>
+        <w:tc>
+          <w:tcPr>
+            <w:tcW w:type="dxa" w:w="1735"/>
+            <w:tcMar>
+              <w:top w:type="dxa" w:w="80"/>
+              <w:left w:type="dxa" w:w="110"/>
+              <w:bottom w:type="dxa" w:w="80"/>
+              <w:right w:type="dxa" w:w="110"/>
+            </w:tcMar>
+          </w:tcPr>
+          <w:p>
+            <w:r>
+              <w:rPr>
+                <w:rFonts w:ascii="Arial" w:cs="Arial" w:eastAsia="Arial" w:hAnsi="Arial"/>
+                <w:b w:val="false"/>
+                <w:bCs w:val="false"/>
+                <w:color w:val="1A1A1A"/>
+                <w:sz w:val="19"/>
+                <w:szCs w:val="19"/>
+              </w:rPr>
+              <w:t xml:space="preserve">Specific numbers build trust</w:t>
+            </w:r>
+          </w:p>
+        </w:tc>
+      </w:tr>
+      <w:tr>
+        <w:tc>
+          <w:tcPr>
+            <w:tcW w:type="dxa" w:w="1735"/>
+            <w:shd w:fill="F6F6F6" w:color="auto" w:val="clear"/>
+            <w:tcMar>
+              <w:top w:type="dxa" w:w="80"/>
+              <w:left w:type="dxa" w:w="110"/>
+              <w:bottom w:type="dxa" w:w="80"/>
+              <w:right w:type="dxa" w:w="110"/>
+            </w:tcMar>
+          </w:tcPr>
+          <w:p>
+            <w:r>
+              <w:rPr>
+                <w:rFonts w:ascii="Arial" w:cs="Arial" w:eastAsia="Arial" w:hAnsi="Arial"/>
+                <w:b w:val="false"/>
+                <w:bCs w:val="false"/>
+                <w:color w:val="1A1A1A"/>
+                <w:sz w:val="19"/>
+                <w:szCs w:val="19"/>
+              </w:rPr>
+              <w:t xml:space="preserve">4</w:t>
+            </w:r>
+          </w:p>
+        </w:tc>
+        <w:tc>
+          <w:tcPr>
+            <w:tcW w:type="dxa" w:w="2120"/>
+            <w:shd w:fill="F6F6F6" w:color="auto" w:val="clear"/>
+            <w:tcMar>
+              <w:top w:type="dxa" w:w="80"/>
+              <w:left w:type="dxa" w:w="110"/>
+              <w:bottom w:type="dxa" w:w="80"/>
+              <w:right w:type="dxa" w:w="110"/>
+            </w:tcMar>
+          </w:tcPr>
+          <w:p>
+            <w:r>
+              <w:rPr>
+                <w:rFonts w:ascii="Arial" w:cs="Arial" w:eastAsia="Arial" w:hAnsi="Arial"/>
+                <w:b w:val="false"/>
+                <w:bCs w:val="false"/>
+                <w:color w:val="1A1A1A"/>
+                <w:sz w:val="19"/>
+                <w:szCs w:val="19"/>
+              </w:rPr>
+              <w:t xml:space="preserve">What decision did you make, or avoid, because of that number?</w:t>
+            </w:r>
+          </w:p>
+        </w:tc>
+        <w:tc>
+          <w:tcPr>
+            <w:tcW w:type="dxa" w:w="4048"/>
+            <w:shd w:fill="F6F6F6" w:color="auto" w:val="clear"/>
+            <w:tcMar>
+              <w:top w:type="dxa" w:w="80"/>
+              <w:left w:type="dxa" w:w="110"/>
+              <w:bottom w:type="dxa" w:w="80"/>
+              <w:right w:type="dxa" w:w="110"/>
+            </w:tcMar>
+          </w:tcPr>
+          <w:p>
+            <w:r>
+              <w:rPr>
+                <w:rFonts w:ascii="Arial" w:cs="Arial" w:eastAsia="Arial" w:hAnsi="Arial"/>
+                <w:b w:val="false"/>
+                <w:bCs w:val="false"/>
+                <w:color w:val="1A1A1A"/>
+                <w:sz w:val="19"/>
+                <w:szCs w:val="19"/>
+              </w:rPr>
+              <w:t xml:space="preserve">Anong desisyon ang ginawa mo, o hindi mo ginawa, dahil sa numerong 'yon?</w:t>
+            </w:r>
+          </w:p>
+        </w:tc>
+        <w:tc>
+          <w:tcPr>
+            <w:tcW w:type="dxa" w:w="1735"/>
+            <w:shd w:fill="F6F6F6" w:color="auto" w:val="clear"/>
+            <w:tcMar>
+              <w:top w:type="dxa" w:w="80"/>
+              <w:left w:type="dxa" w:w="110"/>
+              <w:bottom w:type="dxa" w:w="80"/>
+              <w:right w:type="dxa" w:w="110"/>
+            </w:tcMar>
+          </w:tcPr>
+          <w:p>
+            <w:r>
+              <w:rPr>
+                <w:rFonts w:ascii="Arial" w:cs="Arial" w:eastAsia="Arial" w:hAnsi="Arial"/>
+                <w:b w:val="false"/>
+                <w:bCs w:val="false"/>
+                <w:color w:val="1A1A1A"/>
+                <w:sz w:val="19"/>
+                <w:szCs w:val="19"/>
+              </w:rPr>
+              <w:t xml:space="preserve">Shows the "after"</w:t>
+            </w:r>
+          </w:p>
+        </w:tc>
+      </w:tr>
+      <w:tr>
+        <w:tc>
+          <w:tcPr>
+            <w:tcW w:type="dxa" w:w="1735"/>
+            <w:tcMar>
+              <w:top w:type="dxa" w:w="80"/>
+              <w:left w:type="dxa" w:w="110"/>
+              <w:bottom w:type="dxa" w:w="80"/>
+              <w:right w:type="dxa" w:w="110"/>
+            </w:tcMar>
+          </w:tcPr>
+          <w:p>
+            <w:r>
+              <w:rPr>
+                <w:rFonts w:ascii="Arial" w:cs="Arial" w:eastAsia="Arial" w:hAnsi="Arial"/>
+                <w:b w:val="false"/>
+                <w:bCs w:val="false"/>
+                <w:color w:val="1A1A1A"/>
+                <w:sz w:val="19"/>
+                <w:szCs w:val="19"/>
+              </w:rPr>
+              <w:t xml:space="preserve">5</w:t>
+            </w:r>
+          </w:p>
+        </w:tc>
+        <w:tc>
+          <w:tcPr>
+            <w:tcW w:type="dxa" w:w="2120"/>
+            <w:tcMar>
+              <w:top w:type="dxa" w:w="80"/>
+              <w:left w:type="dxa" w:w="110"/>
+              <w:bottom w:type="dxa" w:w="80"/>
+              <w:right w:type="dxa" w:w="110"/>
+            </w:tcMar>
+          </w:tcPr>
+          <w:p>
+            <w:r>
+              <w:rPr>
+                <w:rFonts w:ascii="Arial" w:cs="Arial" w:eastAsia="Arial" w:hAnsi="Arial"/>
+                <w:b w:val="false"/>
+                <w:bCs w:val="false"/>
+                <w:color w:val="1A1A1A"/>
+                <w:sz w:val="19"/>
+                <w:szCs w:val="19"/>
+              </w:rPr>
+              <w:t xml:space="preserve">What would you tell an owner who is still guessing?</w:t>
+            </w:r>
+          </w:p>
+        </w:tc>
+        <w:tc>
+          <w:tcPr>
+            <w:tcW w:type="dxa" w:w="4048"/>
+            <w:tcMar>
+              <w:top w:type="dxa" w:w="80"/>
+              <w:left w:type="dxa" w:w="110"/>
+              <w:bottom w:type="dxa" w:w="80"/>
+              <w:right w:type="dxa" w:w="110"/>
+            </w:tcMar>
+          </w:tcPr>
+          <w:p>
+            <w:r>
+              <w:rPr>
+                <w:rFonts w:ascii="Arial" w:cs="Arial" w:eastAsia="Arial" w:hAnsi="Arial"/>
+                <w:b w:val="false"/>
+                <w:bCs w:val="false"/>
+                <w:color w:val="1A1A1A"/>
+                <w:sz w:val="19"/>
+                <w:szCs w:val="19"/>
+              </w:rPr>
+              <w:t xml:space="preserve">Ano ang sasabihin mo sa owner na nanghuhula pa rin?</w:t>
+            </w:r>
+          </w:p>
+        </w:tc>
+        <w:tc>
+          <w:tcPr>
+            <w:tcW w:type="dxa" w:w="1735"/>
+            <w:tcMar>
+              <w:top w:type="dxa" w:w="80"/>
+              <w:left w:type="dxa" w:w="110"/>
+              <w:bottom w:type="dxa" w:w="80"/>
+              <w:right w:type="dxa" w:w="110"/>
+            </w:tcMar>
+          </w:tcPr>
+          <w:p>
+            <w:r>
+              <w:rPr>
+                <w:rFonts w:ascii="Arial" w:cs="Arial" w:eastAsia="Arial" w:hAnsi="Arial"/>
+                <w:b w:val="false"/>
+                <w:bCs w:val="false"/>
+                <w:color w:val="1A1A1A"/>
+                <w:sz w:val="19"/>
+                <w:szCs w:val="19"/>
+              </w:rPr>
+              <w:t xml:space="preserve">Gives you a ready quote</w:t>
+            </w:r>
+          </w:p>
+        </w:tc>
+      </w:tr>
+    </w:tbl>
+    <w:p>
+      <w:pPr>
+        <w:spacing w:after="120"/>
+      </w:pPr>
+    </w:p>
+    <w:p>
+      <w:pPr>
+        <w:spacing w:after="100" w:line="300"/>
+      </w:pPr>
+      <w:r>
+        <w:rPr>
+          <w:rFonts w:ascii="Arial" w:cs="Arial" w:eastAsia="Arial" w:hAnsi="Arial"/>
+          <w:b/>
+          <w:bCs/>
+          <w:sz w:val="21"/>
+          <w:szCs w:val="21"/>
+        </w:rPr>
+        <w:t xml:space="preserve">Question 2 is the most valuable one.</w:t>
+      </w:r>
+      <w:r>
+        <w:rPr>
+          <w:rFonts w:ascii="Arial" w:cs="Arial" w:eastAsia="Arial" w:hAnsi="Arial"/>
+          <w:sz w:val="21"/>
+          <w:szCs w:val="21"/>
+        </w:rPr>
+        <w:t xml:space="preserve"> When a client says </w:t>
+      </w:r>
+      <w:r>
+        <w:rPr>
+          <w:rFonts w:ascii="Arial" w:cs="Arial" w:eastAsia="Arial" w:hAnsi="Arial"/>
+          <w:i/>
+          <w:iCs/>
+          <w:sz w:val="21"/>
+          <w:szCs w:val="21"/>
+        </w:rPr>
+        <w:t xml:space="preserve">"I was scared it was another hype program. It wasn't,"</w:t>
+      </w:r>
+      <w:r>
+        <w:rPr>
+          <w:rFonts w:ascii="Arial" w:cs="Arial" w:eastAsia="Arial" w:hAnsi="Arial"/>
+          <w:sz w:val="21"/>
+          <w:szCs w:val="21"/>
+        </w:rPr>
+        <w:t xml:space="preserve"> that answers the doubt better than anything Gilbert can say himself.</w:t>
+      </w:r>
+    </w:p>
+    <w:p>
+      <w:pPr>
+        <w:pStyle w:val="Heading3"/>
+        <w:spacing w:after="80" w:before="200"/>
+      </w:pPr>
+      <w:r>
+        <w:rPr>
+          <w:rFonts w:ascii="Arial" w:cs="Arial" w:eastAsia="Arial" w:hAnsi="Arial"/>
+          <w:b/>
+          <w:bCs/>
+          <w:color w:val="1A1A1A"/>
+          <w:sz w:val="24"/>
+          <w:szCs w:val="24"/>
+        </w:rPr>
+        <w:t xml:space="preserve">Step 4 · If they send a video</w:t>
+      </w:r>
+    </w:p>
+    <w:p>
+      <w:pPr>
+        <w:pStyle w:val="ListParagraph"/>
+        <w:numPr>
+          <w:ilvl w:val="0"/>
+          <w:numId w:val="3"/>
+        </w:numPr>
+        <w:spacing w:after="60"/>
+      </w:pPr>
+      <w:r>
+        <w:rPr>
+          <w:rFonts w:ascii="Arial" w:cs="Arial" w:eastAsia="Arial" w:hAnsi="Arial"/>
+          <w:sz w:val="21"/>
+          <w:szCs w:val="21"/>
+        </w:rPr>
+        <w:t xml:space="preserve">Hold the phone </w:t>
+      </w:r>
+      <w:r>
+        <w:rPr>
+          <w:rFonts w:ascii="Arial" w:cs="Arial" w:eastAsia="Arial" w:hAnsi="Arial"/>
+          <w:b/>
+          <w:bCs/>
+          <w:sz w:val="21"/>
+          <w:szCs w:val="21"/>
+        </w:rPr>
+        <w:t xml:space="preserve">vertically</w:t>
+      </w:r>
+      <w:r>
+        <w:rPr>
+          <w:rFonts w:ascii="Arial" w:cs="Arial" w:eastAsia="Arial" w:hAnsi="Arial"/>
+          <w:sz w:val="21"/>
+          <w:szCs w:val="21"/>
+        </w:rPr>
+        <w:t xml:space="preserve">, at eye level, facing a window.</w:t>
+      </w:r>
+    </w:p>
+    <w:p>
+      <w:pPr>
+        <w:pStyle w:val="ListParagraph"/>
+        <w:numPr>
+          <w:ilvl w:val="0"/>
+          <w:numId w:val="3"/>
+        </w:numPr>
+        <w:spacing w:after="60"/>
+      </w:pPr>
+      <w:r>
+        <w:rPr>
+          <w:rFonts w:ascii="Arial" w:cs="Arial" w:eastAsia="Arial" w:hAnsi="Arial"/>
+          <w:b/>
+          <w:bCs/>
+          <w:sz w:val="21"/>
+          <w:szCs w:val="21"/>
+        </w:rPr>
+        <w:t xml:space="preserve">30–45 seconds</w:t>
+      </w:r>
+      <w:r>
+        <w:rPr>
+          <w:rFonts w:ascii="Arial" w:cs="Arial" w:eastAsia="Arial" w:hAnsi="Arial"/>
+          <w:sz w:val="21"/>
+          <w:szCs w:val="21"/>
+        </w:rPr>
+        <w:t xml:space="preserve"> is enough. They should answer questions 1, 3 and 4 out loud.</w:t>
+      </w:r>
+    </w:p>
+    <w:p>
+      <w:pPr>
+        <w:pStyle w:val="ListParagraph"/>
+        <w:numPr>
+          <w:ilvl w:val="0"/>
+          <w:numId w:val="3"/>
+        </w:numPr>
+        <w:spacing w:after="60"/>
+      </w:pPr>
+      <w:r>
+        <w:rPr>
+          <w:rFonts w:ascii="Arial" w:cs="Arial" w:eastAsia="Arial" w:hAnsi="Arial"/>
+          <w:sz w:val="21"/>
+          <w:szCs w:val="21"/>
+        </w:rPr>
+        <w:t xml:space="preserve">Their own words, their own language. Taglish is perfect.</w:t>
+      </w:r>
+    </w:p>
+    <w:p>
+      <w:pPr>
+        <w:pStyle w:val="Heading3"/>
+        <w:spacing w:after="80" w:before="200"/>
+      </w:pPr>
+      <w:r>
+        <w:rPr>
+          <w:rFonts w:ascii="Arial" w:cs="Arial" w:eastAsia="Arial" w:hAnsi="Arial"/>
+          <w:b/>
+          <w:bCs/>
+          <w:color w:val="1A1A1A"/>
+          <w:sz w:val="24"/>
+          <w:szCs w:val="24"/>
+        </w:rPr>
+        <w:t xml:space="preserve">Step 5 · The rules (protect trust)</w:t>
+      </w:r>
+    </w:p>
+    <w:p>
+      <w:pPr>
+        <w:pStyle w:val="ListParagraph"/>
+        <w:numPr>
+          <w:ilvl w:val="0"/>
+          <w:numId w:val="3"/>
+        </w:numPr>
+        <w:spacing w:after="60"/>
+      </w:pPr>
+      <w:r>
+        <w:rPr>
+          <w:rFonts w:ascii="Arial" w:cs="Arial" w:eastAsia="Arial" w:hAnsi="Arial"/>
+          <w:b/>
+          <w:bCs/>
+          <w:sz w:val="21"/>
+          <w:szCs w:val="21"/>
+        </w:rPr>
+        <w:t xml:space="preserve">Never write the testimonial for them.</w:t>
+      </w:r>
+      <w:r>
+        <w:rPr>
+          <w:rFonts w:ascii="Arial" w:cs="Arial" w:eastAsia="Arial" w:hAnsi="Arial"/>
+          <w:sz w:val="21"/>
+          <w:szCs w:val="21"/>
+        </w:rPr>
+        <w:t xml:space="preserve"> You may fix spelling only. Never change what they meant.</w:t>
+      </w:r>
+    </w:p>
+    <w:p>
+      <w:pPr>
+        <w:pStyle w:val="ListParagraph"/>
+        <w:numPr>
+          <w:ilvl w:val="0"/>
+          <w:numId w:val="3"/>
+        </w:numPr>
+        <w:spacing w:after="60"/>
+      </w:pPr>
+      <w:r>
+        <w:rPr>
+          <w:rFonts w:ascii="Arial" w:cs="Arial" w:eastAsia="Arial" w:hAnsi="Arial"/>
+          <w:b/>
+          <w:bCs/>
+          <w:sz w:val="21"/>
+          <w:szCs w:val="21"/>
+        </w:rPr>
+        <w:t xml:space="preserve">Get permission in writing</w:t>
+      </w:r>
+      <w:r>
+        <w:rPr>
+          <w:rFonts w:ascii="Arial" w:cs="Arial" w:eastAsia="Arial" w:hAnsi="Arial"/>
+          <w:sz w:val="21"/>
+          <w:szCs w:val="21"/>
+        </w:rPr>
+        <w:t xml:space="preserve">, even a Messenger "yes" is enough. Save a screenshot. This also respects the Philippine Data Privacy Act.</w:t>
+      </w:r>
+    </w:p>
+    <w:p>
+      <w:pPr>
+        <w:pStyle w:val="ListParagraph"/>
+        <w:numPr>
+          <w:ilvl w:val="0"/>
+          <w:numId w:val="3"/>
+        </w:numPr>
+        <w:spacing w:after="60"/>
+      </w:pPr>
+      <w:r>
+        <w:rPr>
+          <w:rFonts w:ascii="Arial" w:cs="Arial" w:eastAsia="Arial" w:hAnsi="Arial"/>
+          <w:b/>
+          <w:bCs/>
+          <w:sz w:val="21"/>
+          <w:szCs w:val="21"/>
+        </w:rPr>
+        <w:t xml:space="preserve">Only share figures they approved.</w:t>
+      </w:r>
+      <w:r>
+        <w:rPr>
+          <w:rFonts w:ascii="Arial" w:cs="Arial" w:eastAsia="Arial" w:hAnsi="Arial"/>
+          <w:sz w:val="21"/>
+          <w:szCs w:val="21"/>
+        </w:rPr>
+        <w:t xml:space="preserve"> If they say "no exact numbers", use "found my break-even" without the ₱.</w:t>
+      </w:r>
+    </w:p>
+    <w:p>
+      <w:pPr>
+        <w:pStyle w:val="ListParagraph"/>
+        <w:numPr>
+          <w:ilvl w:val="0"/>
+          <w:numId w:val="3"/>
+        </w:numPr>
+        <w:spacing w:after="60"/>
+      </w:pPr>
+      <w:r>
+        <w:rPr>
+          <w:rFonts w:ascii="Arial" w:cs="Arial" w:eastAsia="Arial" w:hAnsi="Arial"/>
+          <w:b/>
+          <w:bCs/>
+          <w:sz w:val="21"/>
+          <w:szCs w:val="21"/>
+        </w:rPr>
+        <w:t xml:space="preserve">No promises.</w:t>
+      </w:r>
+      <w:r>
+        <w:rPr>
+          <w:rFonts w:ascii="Arial" w:cs="Arial" w:eastAsia="Arial" w:hAnsi="Arial"/>
+          <w:sz w:val="21"/>
+          <w:szCs w:val="21"/>
+        </w:rPr>
+        <w:t xml:space="preserve"> Never add "you'll earn ₱X too." Results differ by business.</w:t>
+      </w:r>
+    </w:p>
+    <w:p>
+      <w:pPr>
+        <w:pStyle w:val="Heading3"/>
+        <w:spacing w:after="80" w:before="200"/>
+      </w:pPr>
+      <w:r>
+        <w:rPr>
+          <w:rFonts w:ascii="Arial" w:cs="Arial" w:eastAsia="Arial" w:hAnsi="Arial"/>
+          <w:b/>
+          <w:bCs/>
+          <w:color w:val="1A1A1A"/>
+          <w:sz w:val="24"/>
+          <w:szCs w:val="24"/>
+        </w:rPr>
+        <w:t xml:space="preserve">Step 6 · Where to use them</w:t>
+      </w:r>
+    </w:p>
+    <w:p>
+      <w:pPr>
+        <w:pStyle w:val="ListParagraph"/>
+        <w:numPr>
+          <w:ilvl w:val="0"/>
+          <w:numId w:val="2"/>
+        </w:numPr>
+        <w:spacing w:after="60"/>
+      </w:pPr>
+      <w:r>
+        <w:rPr>
+          <w:rFonts w:ascii="Arial" w:cs="Arial" w:eastAsia="Arial" w:hAnsi="Arial"/>
+          <w:b/>
+          <w:bCs/>
+          <w:sz w:val="21"/>
+          <w:szCs w:val="21"/>
+        </w:rPr>
+        <w:t xml:space="preserve">Short video clip</w:t>
+      </w:r>
+      <w:r>
+        <w:rPr>
+          <w:rFonts w:ascii="Arial" w:cs="Arial" w:eastAsia="Arial" w:hAnsi="Arial"/>
+          <w:sz w:val="21"/>
+          <w:szCs w:val="21"/>
+        </w:rPr>
+        <w:t xml:space="preserve">: their 30-second answer, with captions, posted as its own Reel.</w:t>
+      </w:r>
+    </w:p>
+    <w:p>
+      <w:pPr>
+        <w:pStyle w:val="ListParagraph"/>
+        <w:numPr>
+          <w:ilvl w:val="0"/>
+          <w:numId w:val="2"/>
+        </w:numPr>
+        <w:spacing w:after="60"/>
+      </w:pPr>
+      <w:r>
+        <w:rPr>
+          <w:rFonts w:ascii="Arial" w:cs="Arial" w:eastAsia="Arial" w:hAnsi="Arial"/>
+          <w:b/>
+          <w:bCs/>
+          <w:sz w:val="21"/>
+          <w:szCs w:val="21"/>
+        </w:rPr>
+        <w:t xml:space="preserve">Proof card</w:t>
+      </w:r>
+      <w:r>
+        <w:rPr>
+          <w:rFonts w:ascii="Arial" w:cs="Arial" w:eastAsia="Arial" w:hAnsi="Arial"/>
+          <w:sz w:val="21"/>
+          <w:szCs w:val="21"/>
+        </w:rPr>
+        <w:t xml:space="preserve">: their best line and first name on a clean image. The </w:t>
+      </w:r>
+      <w:r>
+        <w:rPr>
+          <w:rFonts w:ascii="Courier New" w:cs="Courier New" w:eastAsia="Courier New" w:hAnsi="Courier New"/>
+          <w:color w:val="5B5B5B"/>
+          <w:sz w:val="19"/>
+          <w:szCs w:val="19"/>
+        </w:rPr>
+        <w:t xml:space="preserve">social-proof-card-studio</w:t>
+      </w:r>
+      <w:r>
+        <w:rPr>
+          <w:rFonts w:ascii="Arial" w:cs="Arial" w:eastAsia="Arial" w:hAnsi="Arial"/>
+          <w:sz w:val="21"/>
+          <w:szCs w:val="21"/>
+        </w:rPr>
+        <w:t xml:space="preserve"> skill can design these.</w:t>
+      </w:r>
+    </w:p>
+    <w:p>
+      <w:pPr>
+        <w:pStyle w:val="ListParagraph"/>
+        <w:numPr>
+          <w:ilvl w:val="0"/>
+          <w:numId w:val="2"/>
+        </w:numPr>
+        <w:spacing w:after="60"/>
+      </w:pPr>
+      <w:r>
+        <w:rPr>
+          <w:rFonts w:ascii="Arial" w:cs="Arial" w:eastAsia="Arial" w:hAnsi="Arial"/>
+          <w:b/>
+          <w:bCs/>
+          <w:sz w:val="21"/>
+          <w:szCs w:val="21"/>
+        </w:rPr>
+        <w:t xml:space="preserve">Inside your videos</w:t>
+      </w:r>
+      <w:r>
+        <w:rPr>
+          <w:rFonts w:ascii="Arial" w:cs="Arial" w:eastAsia="Arial" w:hAnsi="Arial"/>
+          <w:sz w:val="21"/>
+          <w:szCs w:val="21"/>
+        </w:rPr>
+        <w:t xml:space="preserve">: add one line after a CTA, e.g. </w:t>
+      </w:r>
+      <w:r>
+        <w:rPr>
+          <w:rFonts w:ascii="Arial" w:cs="Arial" w:eastAsia="Arial" w:hAnsi="Arial"/>
+          <w:i/>
+          <w:iCs/>
+          <w:sz w:val="21"/>
+          <w:szCs w:val="21"/>
+        </w:rPr>
+        <w:t xml:space="preserve">"Like [Name], who found out their break-even was ₱___."</w:t>
+      </w:r>
+    </w:p>
+    <w:p>
+      <w:pPr>
+        <w:pStyle w:val="ListParagraph"/>
+        <w:numPr>
+          <w:ilvl w:val="0"/>
+          <w:numId w:val="2"/>
+        </w:numPr>
+        <w:spacing w:after="60"/>
+      </w:pPr>
+      <w:r>
+        <w:rPr>
+          <w:rFonts w:ascii="Arial" w:cs="Arial" w:eastAsia="Arial" w:hAnsi="Arial"/>
+          <w:b/>
+          <w:bCs/>
+          <w:sz w:val="21"/>
+          <w:szCs w:val="21"/>
+        </w:rPr>
+        <w:t xml:space="preserve">Sales calls</w:t>
+      </w:r>
+      <w:r>
+        <w:rPr>
+          <w:rFonts w:ascii="Arial" w:cs="Arial" w:eastAsia="Arial" w:hAnsi="Arial"/>
+          <w:sz w:val="21"/>
+          <w:szCs w:val="21"/>
+        </w:rPr>
+        <w:t xml:space="preserve">: when someone says "I've been burned before," share the story from question 2.</w:t>
+      </w:r>
+    </w:p>
+    <w:p>
+      <w:r>
+        <w:br w:type="page"/>
+      </w:r>
+    </w:p>
+    <w:p>
+      <w:pPr>
+        <w:pStyle w:val="Heading2"/>
+        <w:pBdr>
+          <w:bottom w:val="single" w:color="0F2A4A" w:sz="8" w:space="4"/>
+        </w:pBdr>
+        <w:spacing w:after="120" w:before="240"/>
+      </w:pPr>
+      <w:r>
+        <w:rPr>
+          <w:rFonts w:ascii="Arial" w:cs="Arial" w:eastAsia="Arial" w:hAnsi="Arial"/>
+          <w:b/>
+          <w:bCs/>
+          <w:color w:val="1A1A1A"/>
+          <w:sz w:val="30"/>
+          <w:szCs w:val="30"/>
+        </w:rPr>
+        <w:t xml:space="preserve">Filming plan (batch all 13 in 2 sessions)</w:t>
+      </w:r>
+    </w:p>
+    <w:tbl>
+      <w:tblPr>
+        <w:tblW w:type="dxa" w:w="9638"/>
+        <w:tblBorders>
+          <w:top w:val="single" w:color="auto" w:sz="4"/>
+          <w:left w:val="single" w:color="auto" w:sz="4"/>
+          <w:bottom w:val="single" w:color="auto" w:sz="4"/>
+          <w:right w:val="single" w:color="auto" w:sz="4"/>
+          <w:insideH w:val="single" w:color="auto" w:sz="4"/>
+          <w:insideV w:val="single" w:color="auto" w:sz="4"/>
+        </w:tblBorders>
+        <w:tblLayout w:type="fixed"/>
+      </w:tblPr>
+      <w:tblGrid>
+        <w:gridCol w:w="1735"/>
+        <w:gridCol w:w="2120"/>
+        <w:gridCol w:w="4048"/>
+        <w:gridCol w:w="1735"/>
+      </w:tblGrid>
+      <w:tr>
+        <w:trPr>
+          <w:tblHeader/>
+        </w:trPr>
+        <w:tc>
+          <w:tcPr>
+            <w:tcW w:type="dxa" w:w="1735"/>
+            <w:shd w:fill="0F2A4A" w:color="auto" w:val="clear"/>
             <w:tcMar>
               <w:top w:type="dxa" w:w="80"/>
               <w:left w:type="dxa" w:w="110"/>
@@ -18171,7 +21298,7 @@
         <w:tc>
           <w:tcPr>
             <w:tcW w:type="dxa" w:w="2120"/>
-            <w:shd w:fill="E90D41" w:color="auto" w:val="clear"/>
+            <w:shd w:fill="0F2A4A" w:color="auto" w:val="clear"/>
             <w:tcMar>
               <w:top w:type="dxa" w:w="80"/>
               <w:left w:type="dxa" w:w="110"/>
@@ -18196,7 +21323,7 @@
         <w:tc>
           <w:tcPr>
             <w:tcW w:type="dxa" w:w="4048"/>
-            <w:shd w:fill="E90D41" w:color="auto" w:val="clear"/>
+            <w:shd w:fill="0F2A4A" w:color="auto" w:val="clear"/>
             <w:tcMar>
               <w:top w:type="dxa" w:w="80"/>
               <w:left w:type="dxa" w:w="110"/>
@@ -18221,7 +21348,7 @@
         <w:tc>
           <w:tcPr>
             <w:tcW w:type="dxa" w:w="1735"/>
-            <w:shd w:fill="E90D41" w:color="auto" w:val="clear"/>
+            <w:shd w:fill="0F2A4A" w:color="auto" w:val="clear"/>
             <w:tcMar>
               <w:top w:type="dxa" w:w="80"/>
               <w:left w:type="dxa" w:w="110"/>
@@ -18289,7 +21416,7 @@
                 <w:sz w:val="19"/>
                 <w:szCs w:val="19"/>
               </w:rPr>
-              <w:t xml:space="preserve">G1–G6, English + Taglish</w:t>
+              <w:t xml:space="preserve">G1–G7, English + Taglish</w:t>
             </w:r>
           </w:p>
         </w:tc>
@@ -18337,7 +21464,7 @@
                 <w:sz w:val="19"/>
                 <w:szCs w:val="19"/>
               </w:rPr>
-              <w:t xml:space="preserve">~2 hrs</w:t>
+              <w:t xml:space="preserve">~2.5 hrs</w:t>
             </w:r>
           </w:p>
         </w:tc>
@@ -18529,7 +21656,7 @@
           <w:sz w:val="21"/>
           <w:szCs w:val="21"/>
         </w:rPr>
-        <w:t xml:space="preserve">Cash Flow</w:t>
+        <w:t xml:space="preserve">Cash Flow, plus G7 (Trust) the same week</w:t>
       </w:r>
     </w:p>
     <w:p>
@@ -18621,7 +21748,7 @@
       <w:pPr>
         <w:pStyle w:val="Heading2"/>
         <w:pBdr>
-          <w:bottom w:val="single" w:color="E90D41" w:sz="8" w:space="4"/>
+          <w:bottom w:val="single" w:color="0F2A4A" w:sz="8" w:space="4"/>
         </w:pBdr>
         <w:spacing w:after="120" w:before="240"/>
       </w:pPr>

</xml_diff>